<commit_message>
topicos ufo-c e ontouml
</commit_message>
<xml_diff>
--- a/backup/tcc-jec.docx
+++ b/backup/tcc-jec.docx
@@ -11043,19 +11043,7 @@
         <w:jc w:val="both"/>
       </w:pPr>
       <w:r>
-        <w:t xml:space="preserve">Outro ponto relevante da SABiO é a possibilidade de modularização da ontologia. Em domínios complexos, como o jurídico, a </w:t>
-      </w:r>
-      <w:r>
-        <w:t>repartiçao</w:t>
-      </w:r>
-      <w:r>
-        <w:t xml:space="preserve"> em módulos ou subontologias pode facilitar o desenvolvimento, a manutenção e a reutilização do modelo. No caso do Juizado Especial Federal Cível, a ontologia pode ser organizada em módulos relacionados, por exemplo, aos sujeitos processuais, à demanda judicial, às </w:t>
-      </w:r>
-      <w:r>
-        <w:t>competencias</w:t>
-      </w:r>
-      <w:r>
-        <w:t xml:space="preserve">, e aos </w:t>
+        <w:t xml:space="preserve">Outro ponto relevante da SABiO é a possibilidade de modularização da ontologia. Em domínios complexos, como o jurídico, a repartiçao em módulos ou subontologias pode facilitar o desenvolvimento, a manutenção e a reutilização do modelo. No caso do Juizado Especial Federal Cível, a ontologia pode ser organizada em módulos relacionados, por exemplo, aos sujeitos processuais, à demanda judicial, às competencias, e aos </w:t>
       </w:r>
       <w:r>
         <w:t>procedimentos</w:t>
@@ -11072,25 +11060,7 @@
         <w:jc w:val="both"/>
       </w:pPr>
       <w:r>
-        <w:t xml:space="preserve">Além das atividades principais de desenvolvimento, a SABiO </w:t>
-      </w:r>
-      <w:r>
-        <w:t>também recomenda</w:t>
-      </w:r>
-      <w:r>
-        <w:t xml:space="preserve"> processos de apoio, como aquisição de conhecimento, documentação, gerenciamento de configuração,  avaliação</w:t>
-      </w:r>
-      <w:r>
-        <w:t xml:space="preserve"> e reuso</w:t>
-      </w:r>
-      <w:r>
-        <w:t>. A documentação é especialmente importante para registrar as decisões tomadas durante a modelagem, os conceitos definidos</w:t>
-      </w:r>
-      <w:r>
-        <w:t xml:space="preserve"> e</w:t>
-      </w:r>
-      <w:r>
-        <w:t xml:space="preserve"> as relações. Já a avaliação busca verificar se a ontologia atende ao propósito para o qual foi construída, se responde às perguntas de competência e se apresenta clareza, coerência e consistência conceitual.</w:t>
+        <w:t>Além das atividades principais de desenvolvimento, a SABiO também recomenda processos de apoio, como aquisição de conhecimento, documentação, gerenciamento de configuração,  avaliação e reuso. A documentação é especialmente importante para registrar as decisões tomadas durante a modelagem, os conceitos definidos e as relações. Já a avaliação busca verificar se a ontologia atende ao propósito para o qual foi construída, se responde às perguntas de competência e se apresenta clareza, coerência e consistência conceitual.</w:t>
       </w:r>
     </w:p>
     <w:p>
@@ -11101,10 +11071,7 @@
         <w:jc w:val="both"/>
       </w:pPr>
       <w:r>
-        <w:t>Dessa forma, a SABiO contribui diretamente para o desenvolvimento deste trabalho, pois oferece um caminho metodológico adequado para a construção da ontologia proposta. As etapas são previstas para serem seguidas como um todo, porem neste trabalho serão trabalhadas apenas os passos relacionado às ontologias de referencias, sendo esses a identificação de requisitos, a definição de perguntas de competência, a captura do conhecimento, a modelagem conceitual, a modularização e a avaliação da ontologia, essa abordagem permite que o modelo seja desenvolvido de forma mais sistemática e alinhada aos objetivos da pesquis</w:t>
-      </w:r>
-      <w:r>
-        <w:t>a</w:t>
+        <w:t>Dessa forma, a SABiO contribui diretamente para o desenvolvimento deste trabalho, pois oferece um caminho metodológico adequado para a construção da ontologia proposta. As etapas são previstas para serem seguidas como um todo, porem neste trabalho serão trabalhadas apenas os passos relacionado às ontologias de referencias, sendo esses a identificação de requisitos, a definição de perguntas de competência, a captura do conhecimento, a modelagem conceitual, a modularização e a avaliação da ontologia, essa abordagem permite que o modelo seja desenvolvido de forma mais sistemática e alinhada aos objetivos da pesquisa</w:t>
       </w:r>
     </w:p>
     <w:p>
@@ -11122,32 +11089,25 @@
       <w:pPr>
         <w:pStyle w:val="Ttulo3"/>
         <w:spacing w:before="2"/>
-        <w:ind w:left="1009"/>
-        <w:rPr>
-          <w:w w:val="105"/>
-          <w:lang w:val="pt-BR"/>
-        </w:rPr>
-      </w:pPr>
-      <w:r>
-        <w:rPr>
-          <w:w w:val="105"/>
-        </w:rPr>
-        <w:t>2.</w:t>
-      </w:r>
-      <w:r>
-        <w:rPr>
-          <w:w w:val="105"/>
-        </w:rPr>
-        <w:t>3</w:t>
-      </w:r>
-      <w:r>
-        <w:rPr>
-          <w:w w:val="105"/>
-        </w:rPr>
-        <w:t xml:space="preserve"> </w:t>
-      </w:r>
-      <w:r>
-        <w:t>OntoUML e UFO</w:t>
+        <w:ind w:left="757"/>
+      </w:pPr>
+      <w:r>
+        <w:rPr>
+          <w:w w:val="105"/>
+        </w:rPr>
+        <w:t xml:space="preserve">2.3 </w:t>
+      </w:r>
+      <w:r>
+        <w:t>UFO</w:t>
+      </w:r>
+      <w:r>
+        <w:t xml:space="preserve"> -</w:t>
+      </w:r>
+      <w:r>
+        <w:t xml:space="preserve"> </w:t>
+      </w:r>
+      <w:r>
+        <w:t>Unified Foundational Ontology</w:t>
       </w:r>
     </w:p>
     <w:p>
@@ -11158,10 +11118,7 @@
         <w:jc w:val="both"/>
       </w:pPr>
       <w:r>
-        <w:t>A Unified Foundational Ontology (UFO) é uma ontologia de fundamentação utilizada para apoiar a construção de modelos semanticamente bem fundamentados. Diferentemente de uma ontologia de domínio, que representa um recorte específico da realidade, uma ontologia de fundamentação busca descrever categorias gerais aplicáveis a diferentes áreas do conhecimento, como objetos, eventos, papéis, relações, propriedades e situações sociais (GUIZZARDI, 2005; GUIZZARDI et al., 2015)</w:t>
-      </w:r>
-      <w:r>
-        <w:t>.</w:t>
+        <w:t>A construção de ontologias de domínio exige uma base conceitual capaz de orientar a identificação dos tipos de entidades existentes, suas propriedades e suas relações. Para isso, podem ser utilizadas ontologias de fundamentação, que fornecem categorias gerais aplicáveis a diferentes áreas do conhecimento. Entre essas ontologias, destaca-se a Unified Foundational Ontology (UFO), proposta como uma ontologia de fundamentação voltada ao apoio da modelagem conceitual e à representação semanticamente precisa de domínios complexos (GUIZZARDI, 2005; GUIZZARDI et al., 2015).</w:t>
       </w:r>
     </w:p>
     <w:p>
@@ -11172,35 +11129,11 @@
         <w:jc w:val="both"/>
       </w:pPr>
       <w:r>
-        <w:t>N</w:t>
-      </w:r>
-      <w:r>
-        <w:t xml:space="preserve">a </w:t>
-      </w:r>
-      <w:r>
-        <w:t>modelagem conceitual,</w:t>
-      </w:r>
-      <w:r>
-        <w:t xml:space="preserve"> alguns conceito podem ser representados de maneira ambígua, assim</w:t>
-      </w:r>
-      <w:r>
-        <w:t xml:space="preserve"> a UFO</w:t>
-      </w:r>
-      <w:r>
-        <w:t xml:space="preserve"> se diferencia, ja que</w:t>
-      </w:r>
-      <w:r>
-        <w:t xml:space="preserve"> oferece fundamentos ontológicos</w:t>
-      </w:r>
-      <w:r>
-        <w:t xml:space="preserve"> que contornam esse problema</w:t>
-      </w:r>
-      <w:r>
-        <w:t xml:space="preserve">. Por exemplo, em um domínio jurídico, é necessário distinguir uma pessoa, enquanto entidade que possui identidade própria, dos papéis que essa pessoa pode exercer em determinada relação, como autor, réu, advogado, juiz ou perito. Essa distinção é fundamental porque o papel é temporário e </w:t>
+        <w:t xml:space="preserve">A UFO tem como objetivo oferecer categorias ontológicas capazes de auxiliar a modelagem a distinguir diferentes elementos da realidade, como objetos, eventos, propriedades, papéis, relações e entidades sociais. Essa distinção é importante porque, em muitos domínios, os conceitos não possuem a mesma natureza, alguns representam entidades que mantêm sua identidade ao longo do </w:t>
       </w:r>
       <w:r>
         <w:lastRenderedPageBreak/>
-        <w:t>dependente de um contexto, enquanto a pessoa permanece a mesma entidade, ainda que exerça diferentes papéis ao longo do tempo.</w:t>
+        <w:t>tempo, enquanto outros representam papéis temporários, eventos que ocorrem em determinado momento ou relações dependentes de outros elementos.</w:t>
       </w:r>
     </w:p>
     <w:p>
@@ -11211,10 +11144,8 @@
         <w:jc w:val="both"/>
       </w:pPr>
       <w:r>
-        <w:t>A UFO é organizada em diferentes partes. A UFO-A trata de entidades substanciais, como objetos, agentes, tipos e propriedades. A UFO-B trata de eventos, ou seja, acontecimentos que ocorrem no tempo. A UFO-C, por sua vez, trata de entidades sociais e intencionais, como agentes, compromissos, relações sociais e atos comunicativos (GUIZZARDI et al., 2015). Essa estrutura torna a UFO especialmente útil para domínios em que há interação entre pessoas, organizações, eventos e relações sociais, como ocorre no Direito.</w:t>
-      </w:r>
-      <w:bookmarkStart w:id="25" w:name="_GoBack"/>
-      <w:bookmarkEnd w:id="25"/>
+        <w:t>A UFO costuma ser apresentada em três partes principais: UFO-A, UFO-B e UFO-C. A UFO-A trata de entidades substanciais, propriedades, tipos e relações estruturais; a UFO-B aborda eventos e ocorrências temporais; e a UFO-C trata de aspectos sociais e intencionais, como agentes, papéis sociais, compromissos e relações sociais (GUIZZARDI, 2005; GUIZZARDI et al., 2015). Essa divisão permite analisar um domínio a partir de diferentes dimensões, o que é útil para representar áreas complexas, como o Direito.</w:t>
+      </w:r>
     </w:p>
     <w:p>
       <w:pPr>
@@ -11222,15 +11153,1764 @@
         <w:spacing w:before="100"/>
         <w:ind w:right="147" w:firstLine="272"/>
         <w:jc w:val="both"/>
+      </w:pPr>
+    </w:p>
+    <w:p>
+      <w:pPr>
+        <w:pStyle w:val="Ttulo4"/>
+        <w:jc w:val="both"/>
+      </w:pPr>
+      <w:r>
+        <w:t>2.3.</w:t>
+      </w:r>
+      <w:r>
+        <w:t>1</w:t>
+      </w:r>
+      <w:r>
+        <w:t xml:space="preserve"> UFO-A</w:t>
+      </w:r>
+    </w:p>
+    <w:p>
+      <w:pPr>
+        <w:pStyle w:val="Corpodetexto"/>
+        <w:spacing w:before="100"/>
+        <w:ind w:right="147" w:firstLine="272"/>
+        <w:jc w:val="both"/>
+      </w:pPr>
+      <w:r>
+        <w:t>A UFO-A é a parte da Unified Foundational Ontology voltada à representação de entidades chamadas de endurantes, isto é, entidades que persistem no tempo mantendo sua identidade, ainda que possam sofrer mudanças. Essas entidades são diferentes dos eventos, pois não acontecem no tempo, mas permanecem através dele. Uma pessoa, uma organização, um documento e um processo podem ser analisados como exemplos de entidades que conservam identidade ao longo de sua existência.</w:t>
+      </w:r>
+    </w:p>
+    <w:p>
+      <w:pPr>
+        <w:pStyle w:val="Corpodetexto"/>
+        <w:spacing w:before="100"/>
+        <w:ind w:right="147" w:firstLine="272"/>
+        <w:jc w:val="center"/>
         <w:rPr>
           <w:u w:val="single"/>
         </w:rPr>
+      </w:pPr>
+      <w:r>
+        <w:rPr>
+          <w:noProof/>
+        </w:rPr>
+        <w:drawing>
+          <wp:inline distT="0" distB="0" distL="0" distR="0" wp14:anchorId="38F642C4" wp14:editId="26F2D13B">
+            <wp:extent cx="6033135" cy="3535045"/>
+            <wp:effectExtent l="0" t="0" r="5715" b="8255"/>
+            <wp:docPr id="8" name="Imagem 8"/>
+            <wp:cNvGraphicFramePr>
+              <a:graphicFrameLocks xmlns:a="http://schemas.openxmlformats.org/drawingml/2006/main" noChangeAspect="1"/>
+            </wp:cNvGraphicFramePr>
+            <a:graphic xmlns:a="http://schemas.openxmlformats.org/drawingml/2006/main">
+              <a:graphicData uri="http://schemas.openxmlformats.org/drawingml/2006/picture">
+                <pic:pic xmlns:pic="http://schemas.openxmlformats.org/drawingml/2006/picture">
+                  <pic:nvPicPr>
+                    <pic:cNvPr id="1" name=""/>
+                    <pic:cNvPicPr/>
+                  </pic:nvPicPr>
+                  <pic:blipFill>
+                    <a:blip r:embed="rId24"/>
+                    <a:stretch>
+                      <a:fillRect/>
+                    </a:stretch>
+                  </pic:blipFill>
+                  <pic:spPr>
+                    <a:xfrm>
+                      <a:off x="0" y="0"/>
+                      <a:ext cx="6033135" cy="3535045"/>
+                    </a:xfrm>
+                    <a:prstGeom prst="rect">
+                      <a:avLst/>
+                    </a:prstGeom>
+                  </pic:spPr>
+                </pic:pic>
+              </a:graphicData>
+            </a:graphic>
+          </wp:inline>
+        </w:drawing>
+      </w:r>
+    </w:p>
+    <w:p>
+      <w:pPr>
+        <w:pStyle w:val="Corpodetexto"/>
+        <w:spacing w:before="100"/>
+        <w:ind w:right="147" w:firstLine="272"/>
+        <w:jc w:val="center"/>
+      </w:pPr>
+      <w:r>
+        <w:t>Figura 2</w:t>
+      </w:r>
+      <w:r>
+        <w:t xml:space="preserve"> – </w:t>
+      </w:r>
+      <w:r>
+        <w:t>Taxonomia</w:t>
+      </w:r>
+      <w:r>
+        <w:t xml:space="preserve"> de UFO</w:t>
+      </w:r>
+      <w:r>
+        <w:t>-A</w:t>
+      </w:r>
+      <w:r>
+        <w:t xml:space="preserve"> (GUIZZARDI, 2005)</w:t>
+      </w:r>
+    </w:p>
+    <w:p>
+      <w:pPr>
+        <w:pStyle w:val="Corpodetexto"/>
+        <w:spacing w:before="100"/>
+        <w:ind w:right="147" w:firstLine="272"/>
+      </w:pPr>
+    </w:p>
+    <w:p>
+      <w:pPr>
+        <w:pStyle w:val="Corpodetexto"/>
+        <w:spacing w:before="100"/>
+        <w:ind w:right="147" w:firstLine="272"/>
+      </w:pPr>
+      <w:r>
+        <w:t>Um dos conceitos centrais da UFO-A é a distinção entre tipos que fornecem identidade e tipos que apenas classificam uma entidade em determinado contexto. Essa distinção é essencial para a modelagem conceitual, pois permite compreender que nem todo conceito atribuído a uma entidade define aquilo que ela é. Alguns conceitos indicam apenas papéis temporários ou classificações contextuais.</w:t>
+      </w:r>
+      <w:r>
+        <w:t xml:space="preserve"> </w:t>
+      </w:r>
+      <w:r>
+        <w:t>No domínio jurídico, essa diferença pode ser observada na distinção entre “Pessoa” e “Autor”. Uma pessoa é uma entidade que possui identidade própria, independentemente de participar ou não de um processo judicial. Já “Autor” é um papel exercido por uma pessoa ou organização quando ocupa o polo ativo de uma demanda judicial. Assim, a pessoa não deixa de ser pessoa quando o processo termina, mas deixa de exercer o papel de autora naquele contexto específico. O mesmo raciocínio pode ser aplicado aos papéis de réu, advogado, testemunha ou perito.</w:t>
+      </w:r>
+    </w:p>
+    <w:p>
+      <w:pPr>
+        <w:pStyle w:val="Corpodetexto"/>
+        <w:spacing w:before="100"/>
+        <w:ind w:right="147" w:firstLine="272"/>
+        <w:jc w:val="center"/>
+      </w:pPr>
+    </w:p>
+    <w:p>
+      <w:pPr>
+        <w:pStyle w:val="Corpodetexto"/>
+        <w:spacing w:before="100"/>
+        <w:ind w:right="147" w:firstLine="272"/>
+        <w:jc w:val="center"/>
+      </w:pPr>
+    </w:p>
+    <w:p>
+      <w:pPr>
+        <w:pStyle w:val="Ttulo4"/>
+        <w:jc w:val="both"/>
+      </w:pPr>
+      <w:r>
+        <w:lastRenderedPageBreak/>
+        <w:t>2.3.2 UFO-B</w:t>
+      </w:r>
+    </w:p>
+    <w:p>
+      <w:pPr>
+        <w:pStyle w:val="Corpodetexto"/>
+        <w:ind w:firstLine="282"/>
+      </w:pPr>
+      <w:r>
+        <w:t>A UFO-B é a parte da Unified Foundational Ontology voltada à representação de eventos, isto é, entidades que ocorrem no tempo. Diferentemente dos objetos, que permanecem ao longo do tempo mantendo sua identidade, os eventos possuem natureza temporal, pois acontecem, desenvolvem-se e se encerram em determinado intervalo. Assim, enquanto uma pessoa, uma organização ou um documento podem ser analisados como entidades que persistem, uma audiência, uma perícia, uma citação ou a prolação de uma sentença devem ser compreendidas como acontecimentos processuais.</w:t>
+      </w:r>
+    </w:p>
+    <w:p>
+      <w:pPr>
+        <w:pStyle w:val="Corpodetexto"/>
+        <w:ind w:firstLine="282"/>
+      </w:pPr>
+      <w:r>
+        <w:t>No contexto da modelagem conceitual, a distinção entre objetos e eventos é relevante porque permite representar adequadamente a dinâmica dos domínios analisados. Em muitos modelos, atos, atividades e acontecimentos são tratados como simples objetos ou registros, o que pode gerar perda de significado. A UFO-B contribui para evitar esse problema ao permitir que ocorrências temporais sejam modeladas como eventos, evidenciando sua relação com o tempo, com os participantes envolvidos e com os efeitos que produzem no domínio (GUIZZARDI et al., 2013; GUIZZARDI et al., 2015).</w:t>
+      </w:r>
+    </w:p>
+    <w:p>
+      <w:pPr>
+        <w:pStyle w:val="Corpodetexto"/>
+        <w:ind w:firstLine="282"/>
+        <w:jc w:val="center"/>
+      </w:pPr>
+      <w:r>
+        <w:rPr>
+          <w:noProof/>
+        </w:rPr>
+        <w:drawing>
+          <wp:inline distT="0" distB="0" distL="0" distR="0" wp14:anchorId="52186B33" wp14:editId="50FA24D2">
+            <wp:extent cx="5664049" cy="3649648"/>
+            <wp:effectExtent l="0" t="0" r="0" b="8255"/>
+            <wp:docPr id="9" name="Imagem 9"/>
+            <wp:cNvGraphicFramePr>
+              <a:graphicFrameLocks xmlns:a="http://schemas.openxmlformats.org/drawingml/2006/main" noChangeAspect="1"/>
+            </wp:cNvGraphicFramePr>
+            <a:graphic xmlns:a="http://schemas.openxmlformats.org/drawingml/2006/main">
+              <a:graphicData uri="http://schemas.openxmlformats.org/drawingml/2006/picture">
+                <pic:pic xmlns:pic="http://schemas.openxmlformats.org/drawingml/2006/picture">
+                  <pic:nvPicPr>
+                    <pic:cNvPr id="1" name=""/>
+                    <pic:cNvPicPr/>
+                  </pic:nvPicPr>
+                  <pic:blipFill>
+                    <a:blip r:embed="rId25"/>
+                    <a:stretch>
+                      <a:fillRect/>
+                    </a:stretch>
+                  </pic:blipFill>
+                  <pic:spPr>
+                    <a:xfrm>
+                      <a:off x="0" y="0"/>
+                      <a:ext cx="5735929" cy="3695964"/>
+                    </a:xfrm>
+                    <a:prstGeom prst="rect">
+                      <a:avLst/>
+                    </a:prstGeom>
+                  </pic:spPr>
+                </pic:pic>
+              </a:graphicData>
+            </a:graphic>
+          </wp:inline>
+        </w:drawing>
+      </w:r>
+    </w:p>
+    <w:p>
+      <w:pPr>
+        <w:pStyle w:val="Corpodetexto"/>
+        <w:ind w:firstLine="282"/>
+        <w:jc w:val="center"/>
+      </w:pPr>
+      <w:r>
+        <w:t xml:space="preserve">Figura </w:t>
+      </w:r>
+      <w:r>
+        <w:t>3</w:t>
+      </w:r>
+      <w:r>
+        <w:t xml:space="preserve">. </w:t>
+      </w:r>
+      <w:r>
+        <w:t>Taxonomia</w:t>
+      </w:r>
+      <w:r>
+        <w:t xml:space="preserve"> de UFO-B (GUIZZARDI et al., 2013)</w:t>
+      </w:r>
+    </w:p>
+    <w:p>
+      <w:pPr>
+        <w:pStyle w:val="Corpodetexto"/>
+        <w:ind w:firstLine="282"/>
+        <w:jc w:val="center"/>
+      </w:pPr>
+    </w:p>
+    <w:p>
+      <w:pPr>
+        <w:pStyle w:val="Corpodetexto"/>
+        <w:ind w:firstLine="282"/>
+        <w:jc w:val="both"/>
+      </w:pPr>
+      <w:r>
+        <w:t>A representação de eventos também é relevante porque os atos processuais possuem relação direta com prazos, fases e consequências jurídicas. O ajuizamento, a apresentação de contestação, a tentativa de conciliação ou o cumprimento de uma decisão são acontecimentos que podem alterar o andamento do processo. Desse modo, a UFO-B fornece suporte para modelar não apenas quais elementos existem no domínio, mas também como eles se desenvolvem ao longo do tempo.</w:t>
+      </w:r>
+    </w:p>
+    <w:p>
+      <w:pPr>
+        <w:pStyle w:val="Corpodetexto"/>
+        <w:ind w:firstLine="282"/>
+        <w:jc w:val="both"/>
+      </w:pPr>
+    </w:p>
+    <w:p>
+      <w:pPr>
+        <w:pStyle w:val="Ttulo4"/>
+        <w:jc w:val="both"/>
+      </w:pPr>
+      <w:r>
+        <w:t>2.3.2 UFO-C</w:t>
+      </w:r>
+    </w:p>
+    <w:p>
+      <w:pPr>
+        <w:pStyle w:val="Corpodetexto"/>
+        <w:spacing w:before="100"/>
+        <w:ind w:right="147" w:firstLine="272"/>
+        <w:jc w:val="both"/>
+      </w:pPr>
+      <w:r>
+        <w:t>A UFO-C é a parte da Unified Foundational Ontology voltada à representação de aspectos sociais, intencionais e institucionais da realidade. Enquanto a UFO-A trata principalmente de entidades que persistem no tempo e a UFO-B trata de eventos, a UFO-C permite representar agentes, papéis sociais, relações sociais, compromissos, intenções e ações comunicativas. Essa dimensão é especialmente relevante para domínios em que há interação entre pessoas, organizações e instituições, como ocorre no Direito (GUIZZARDI, 2005; GUIZZARDI et al., 2015).</w:t>
+      </w:r>
+    </w:p>
+    <w:p>
+      <w:pPr>
+        <w:pStyle w:val="Corpodetexto"/>
+        <w:spacing w:before="100"/>
+        <w:ind w:right="147" w:firstLine="272"/>
+        <w:jc w:val="both"/>
+      </w:pPr>
+      <w:r>
+        <w:lastRenderedPageBreak/>
+        <w:drawing>
+          <wp:inline distT="0" distB="0" distL="0" distR="0" wp14:anchorId="2BDFC50C" wp14:editId="26C947F7">
+            <wp:extent cx="6033135" cy="3949700"/>
+            <wp:effectExtent l="0" t="0" r="5715" b="0"/>
+            <wp:docPr id="3" name="Imagem 3"/>
+            <wp:cNvGraphicFramePr>
+              <a:graphicFrameLocks xmlns:a="http://schemas.openxmlformats.org/drawingml/2006/main" noChangeAspect="1"/>
+            </wp:cNvGraphicFramePr>
+            <a:graphic xmlns:a="http://schemas.openxmlformats.org/drawingml/2006/main">
+              <a:graphicData uri="http://schemas.openxmlformats.org/drawingml/2006/picture">
+                <pic:pic xmlns:pic="http://schemas.openxmlformats.org/drawingml/2006/picture">
+                  <pic:nvPicPr>
+                    <pic:cNvPr id="1" name=""/>
+                    <pic:cNvPicPr/>
+                  </pic:nvPicPr>
+                  <pic:blipFill>
+                    <a:blip r:embed="rId26"/>
+                    <a:stretch>
+                      <a:fillRect/>
+                    </a:stretch>
+                  </pic:blipFill>
+                  <pic:spPr>
+                    <a:xfrm>
+                      <a:off x="0" y="0"/>
+                      <a:ext cx="6033135" cy="3949700"/>
+                    </a:xfrm>
+                    <a:prstGeom prst="rect">
+                      <a:avLst/>
+                    </a:prstGeom>
+                  </pic:spPr>
+                </pic:pic>
+              </a:graphicData>
+            </a:graphic>
+          </wp:inline>
+        </w:drawing>
+      </w:r>
+    </w:p>
+    <w:p>
+      <w:pPr>
+        <w:pStyle w:val="Corpodetexto"/>
+        <w:spacing w:before="100"/>
+        <w:ind w:right="147" w:firstLine="272"/>
+        <w:jc w:val="center"/>
+      </w:pPr>
+      <w:r>
+        <w:t xml:space="preserve">Figura 4. </w:t>
+      </w:r>
+      <w:r>
+        <w:t>As categorias da ontologia de agentes UFO-C 0.2.</w:t>
+      </w:r>
+      <w:r>
+        <w:t xml:space="preserve"> </w:t>
+      </w:r>
+      <w:r>
+        <w:t>(GUIZZARDI; WAGNER, 2005)</w:t>
+      </w:r>
+    </w:p>
+    <w:p>
+      <w:pPr>
+        <w:pStyle w:val="Corpodetexto"/>
+        <w:spacing w:before="100"/>
+        <w:ind w:right="147" w:firstLine="272"/>
+        <w:jc w:val="center"/>
+      </w:pPr>
+    </w:p>
+    <w:p>
+      <w:pPr>
+        <w:pStyle w:val="Corpodetexto"/>
+        <w:spacing w:before="100"/>
+        <w:ind w:right="147" w:firstLine="272"/>
+        <w:jc w:val="both"/>
+      </w:pPr>
+      <w:r>
+        <w:t>A noção de agente é central para a representação de relações sociais e institucionais. Guizzardi e Wagner (2005) destacam que a UFO foi proposta como uma ontologia de fundamentação para a modelagem conceitual, incluindo a fundamentação de conceitos relacionados a agentes. Essa abordagem contribui para a modelagem do domínio jurídico, pois permite diferenciar agentes, como pessoas e organizações, dos papéis que eles exercem no processo judicial, como autor, réu, advogado, juiz ou perito.</w:t>
+      </w:r>
+    </w:p>
+    <w:p>
+      <w:pPr>
+        <w:pStyle w:val="Corpodetexto"/>
+        <w:spacing w:before="100"/>
+        <w:ind w:right="147" w:firstLine="272"/>
+        <w:jc w:val="both"/>
+      </w:pPr>
+      <w:r>
+        <w:t>A UFO-C também auxilia na compreensão das relações jurídicas e processuais como relações socialmente reconhecidas e normativamente estruturadas. A relação entre autor e réu, por exemplo, não é uma simples associação entre duas entidades, mas uma relação processual gerada a partir de uma demanda judicial. Essa relação envolve direitos, deveres, poderes, faculdades e ônus processuais que decorrem do ordenamento jurídico e dos atos praticados no processo</w:t>
+      </w:r>
+      <w:r>
+        <w:t>.</w:t>
+      </w:r>
+    </w:p>
+    <w:p>
+      <w:pPr>
+        <w:pStyle w:val="Corpodetexto"/>
+        <w:spacing w:before="100"/>
+        <w:ind w:right="147" w:firstLine="272"/>
+        <w:jc w:val="both"/>
+      </w:pPr>
+    </w:p>
+    <w:p>
+      <w:pPr>
+        <w:pStyle w:val="Ttulo3"/>
+        <w:spacing w:before="2"/>
+        <w:ind w:left="757"/>
+      </w:pPr>
+      <w:r>
+        <w:rPr>
+          <w:w w:val="105"/>
+        </w:rPr>
+        <w:t xml:space="preserve">2.3 </w:t>
+      </w:r>
+      <w:r>
+        <w:t>OntoUML</w:t>
+      </w:r>
+    </w:p>
+    <w:p>
+      <w:pPr>
+        <w:pStyle w:val="Corpodetexto"/>
+        <w:spacing w:before="100"/>
+        <w:ind w:right="147" w:firstLine="272"/>
+        <w:jc w:val="both"/>
+      </w:pPr>
+      <w:r>
+        <w:t>A OntoUML é uma linguagem de modelagem conceitual fundamentada na Unified Foundational Ontology (UFO), desenvolvida a partir dos estudos de Guizzardi (2005) sobre fundamentos ontológicos para modelos conceituais estruturais. Seu objetivo é oferecer uma forma mais precisa de representar conceitos de um domínio, permitindo que o modelador diferencie a natureza ontológica dos elementos representados. Assim, a OntoUML não se limita à representação gráfica de classes e associações, mas busca explicitar se determinado elemento corresponde a um tipo essencial, a um papel, a uma fase, a uma propriedade, a uma relação ou a outro tipo de entidade conceitual.</w:t>
+      </w:r>
+    </w:p>
+    <w:p>
+      <w:pPr>
+        <w:pStyle w:val="Corpodetexto"/>
+        <w:spacing w:before="100"/>
+        <w:ind w:right="147" w:firstLine="272"/>
+        <w:jc w:val="both"/>
+      </w:pPr>
+      <w:r>
+        <w:t>A principal diferença entre a UML tradicional e a OntoUML está no uso de estereótipos ontológicos. Enquanto a UML permite representar classes, atributos, associações e generalizações, a OntoUML permite indicar se determinado conceito corresponde, por exemplo, a um tipo que fornece identidade, a um papel contextual, a uma fase, a uma propriedade, a uma categoria ou a uma entidade relacional. Desse modo, a linguagem não apenas representa os conceitos de um domínio, mas também explicita o tipo de entidade que cada conceito representa.</w:t>
+      </w:r>
+    </w:p>
+    <w:p>
+      <w:pPr>
+        <w:pStyle w:val="Corpodetexto"/>
+        <w:jc w:val="center"/>
+      </w:pPr>
+      <w:r>
+        <w:lastRenderedPageBreak/>
+        <w:t>Quadro 1 – Estereótipos de classes da linguagem OntoUML</w:t>
+      </w:r>
+    </w:p>
+    <w:tbl>
+      <w:tblPr>
+        <w:tblStyle w:val="Tabelacomgrade"/>
+        <w:tblW w:w="0" w:type="auto"/>
+        <w:tblInd w:w="1019" w:type="dxa"/>
+        <w:tblLook w:val="04A0" w:firstRow="1" w:lastRow="0" w:firstColumn="1" w:lastColumn="0" w:noHBand="0" w:noVBand="1"/>
+      </w:tblPr>
+      <w:tblGrid>
+        <w:gridCol w:w="2237"/>
+        <w:gridCol w:w="5145"/>
+      </w:tblGrid>
+      <w:tr>
+        <w:trPr>
+          <w:trHeight w:val="402"/>
+        </w:trPr>
+        <w:tc>
+          <w:tcPr>
+            <w:tcW w:w="2237" w:type="dxa"/>
+          </w:tcPr>
+          <w:p>
+            <w:pPr>
+              <w:pStyle w:val="Ttulo3"/>
+              <w:ind w:left="0" w:firstLine="0"/>
+              <w:rPr>
+                <w:rFonts w:ascii="Times New Roman" w:hAnsi="Times New Roman" w:cs="Times New Roman"/>
+                <w:b/>
+                <w:bCs/>
+                <w:sz w:val="24"/>
+                <w:szCs w:val="24"/>
+              </w:rPr>
+            </w:pPr>
+            <w:r>
+              <w:rPr>
+                <w:rFonts w:ascii="Times New Roman" w:hAnsi="Times New Roman" w:cs="Times New Roman"/>
+                <w:b/>
+                <w:bCs/>
+                <w:sz w:val="24"/>
+                <w:szCs w:val="24"/>
+              </w:rPr>
+              <w:t>Classe</w:t>
+            </w:r>
+          </w:p>
+        </w:tc>
+        <w:tc>
+          <w:tcPr>
+            <w:tcW w:w="5145" w:type="dxa"/>
+          </w:tcPr>
+          <w:p>
+            <w:pPr>
+              <w:pStyle w:val="Ttulo3"/>
+              <w:ind w:left="0" w:firstLine="0"/>
+              <w:rPr>
+                <w:rFonts w:ascii="Times New Roman" w:hAnsi="Times New Roman" w:cs="Times New Roman"/>
+                <w:b/>
+                <w:bCs/>
+                <w:sz w:val="24"/>
+                <w:szCs w:val="24"/>
+              </w:rPr>
+            </w:pPr>
+            <w:r>
+              <w:rPr>
+                <w:rFonts w:ascii="Times New Roman" w:hAnsi="Times New Roman" w:cs="Times New Roman"/>
+                <w:b/>
+                <w:bCs/>
+                <w:sz w:val="24"/>
+                <w:szCs w:val="24"/>
+              </w:rPr>
+              <w:t>Descrição</w:t>
+            </w:r>
+          </w:p>
+        </w:tc>
+      </w:tr>
+      <w:tr>
+        <w:trPr>
+          <w:trHeight w:val="390"/>
+        </w:trPr>
+        <w:tc>
+          <w:tcPr>
+            <w:tcW w:w="2237" w:type="dxa"/>
+          </w:tcPr>
+          <w:p>
+            <w:pPr>
+              <w:pStyle w:val="Ttulo3"/>
+              <w:ind w:left="0" w:firstLine="0"/>
+              <w:rPr>
+                <w:rFonts w:ascii="Times New Roman" w:hAnsi="Times New Roman" w:cs="Times New Roman"/>
+                <w:b/>
+                <w:bCs/>
+                <w:i/>
+                <w:iCs/>
+                <w:sz w:val="24"/>
+                <w:szCs w:val="24"/>
+              </w:rPr>
+            </w:pPr>
+            <w:r>
+              <w:rPr>
+                <w:rFonts w:ascii="Times New Roman" w:hAnsi="Times New Roman" w:cs="Times New Roman"/>
+                <w:b/>
+                <w:bCs/>
+                <w:i/>
+                <w:iCs/>
+                <w:sz w:val="24"/>
+                <w:szCs w:val="24"/>
+              </w:rPr>
+              <w:t>Kind</w:t>
+            </w:r>
+          </w:p>
+        </w:tc>
+        <w:tc>
+          <w:tcPr>
+            <w:tcW w:w="5145" w:type="dxa"/>
+          </w:tcPr>
+          <w:p>
+            <w:pPr>
+              <w:pStyle w:val="Ttulo3"/>
+              <w:ind w:left="0" w:firstLine="0"/>
+              <w:rPr>
+                <w:rFonts w:ascii="Times New Roman" w:hAnsi="Times New Roman" w:cs="Times New Roman"/>
+                <w:sz w:val="24"/>
+                <w:szCs w:val="24"/>
+              </w:rPr>
+            </w:pPr>
+            <w:r>
+              <w:rPr>
+                <w:rFonts w:ascii="Times New Roman" w:hAnsi="Times New Roman" w:cs="Times New Roman"/>
+                <w:sz w:val="24"/>
+                <w:szCs w:val="24"/>
+              </w:rPr>
+              <w:t>Representa uma categoria ontológica que fornece princípio de identidade aos seus indivíduos.</w:t>
+            </w:r>
+          </w:p>
+        </w:tc>
+      </w:tr>
+      <w:tr>
+        <w:trPr>
+          <w:trHeight w:val="402"/>
+        </w:trPr>
+        <w:tc>
+          <w:tcPr>
+            <w:tcW w:w="2237" w:type="dxa"/>
+          </w:tcPr>
+          <w:p>
+            <w:pPr>
+              <w:pStyle w:val="Ttulo3"/>
+              <w:ind w:left="0" w:firstLine="0"/>
+              <w:rPr>
+                <w:rFonts w:ascii="Times New Roman" w:hAnsi="Times New Roman" w:cs="Times New Roman"/>
+                <w:b/>
+                <w:bCs/>
+                <w:i/>
+                <w:iCs/>
+                <w:sz w:val="24"/>
+                <w:szCs w:val="24"/>
+              </w:rPr>
+            </w:pPr>
+            <w:r>
+              <w:rPr>
+                <w:rFonts w:ascii="Times New Roman" w:hAnsi="Times New Roman" w:cs="Times New Roman"/>
+                <w:b/>
+                <w:bCs/>
+                <w:i/>
+                <w:iCs/>
+                <w:sz w:val="24"/>
+                <w:szCs w:val="24"/>
+              </w:rPr>
+              <w:t>Subkind</w:t>
+            </w:r>
+          </w:p>
+        </w:tc>
+        <w:tc>
+          <w:tcPr>
+            <w:tcW w:w="5145" w:type="dxa"/>
+          </w:tcPr>
+          <w:p>
+            <w:pPr>
+              <w:pStyle w:val="Ttulo3"/>
+              <w:ind w:left="0" w:firstLine="0"/>
+              <w:rPr>
+                <w:rFonts w:ascii="Times New Roman" w:hAnsi="Times New Roman" w:cs="Times New Roman"/>
+                <w:sz w:val="24"/>
+                <w:szCs w:val="24"/>
+              </w:rPr>
+            </w:pPr>
+            <w:r>
+              <w:rPr>
+                <w:rFonts w:ascii="Times New Roman" w:hAnsi="Times New Roman" w:cs="Times New Roman"/>
+                <w:sz w:val="24"/>
+                <w:szCs w:val="24"/>
+              </w:rPr>
+              <w:t>Representa uma especialização rígida que herda o princípio de identidade fornecido por seu supertipo.</w:t>
+            </w:r>
+          </w:p>
+        </w:tc>
+      </w:tr>
+      <w:tr>
+        <w:trPr>
+          <w:trHeight w:val="390"/>
+        </w:trPr>
+        <w:tc>
+          <w:tcPr>
+            <w:tcW w:w="2237" w:type="dxa"/>
+          </w:tcPr>
+          <w:p>
+            <w:pPr>
+              <w:pStyle w:val="Ttulo3"/>
+              <w:ind w:left="0" w:firstLine="0"/>
+              <w:rPr>
+                <w:rFonts w:ascii="Times New Roman" w:hAnsi="Times New Roman" w:cs="Times New Roman"/>
+                <w:b/>
+                <w:bCs/>
+                <w:i/>
+                <w:iCs/>
+                <w:sz w:val="24"/>
+                <w:szCs w:val="24"/>
+              </w:rPr>
+            </w:pPr>
+            <w:r>
+              <w:rPr>
+                <w:rFonts w:ascii="Times New Roman" w:hAnsi="Times New Roman" w:cs="Times New Roman"/>
+                <w:b/>
+                <w:bCs/>
+                <w:i/>
+                <w:iCs/>
+                <w:sz w:val="24"/>
+                <w:szCs w:val="24"/>
+              </w:rPr>
+              <w:t>Role</w:t>
+            </w:r>
+          </w:p>
+        </w:tc>
+        <w:tc>
+          <w:tcPr>
+            <w:tcW w:w="5145" w:type="dxa"/>
+          </w:tcPr>
+          <w:p>
+            <w:pPr>
+              <w:pStyle w:val="Ttulo3"/>
+              <w:ind w:left="0" w:firstLine="0"/>
+              <w:rPr>
+                <w:rFonts w:ascii="Times New Roman" w:hAnsi="Times New Roman" w:cs="Times New Roman"/>
+                <w:sz w:val="24"/>
+                <w:szCs w:val="24"/>
+              </w:rPr>
+            </w:pPr>
+            <w:r>
+              <w:rPr>
+                <w:rFonts w:ascii="Times New Roman" w:hAnsi="Times New Roman" w:cs="Times New Roman"/>
+                <w:sz w:val="24"/>
+                <w:szCs w:val="24"/>
+              </w:rPr>
+              <w:t>Representa um conceito antirrígido que define o papel exercido por uma entidade em determinado contexto.</w:t>
+            </w:r>
+          </w:p>
+        </w:tc>
+      </w:tr>
+      <w:tr>
+        <w:trPr>
+          <w:trHeight w:val="402"/>
+        </w:trPr>
+        <w:tc>
+          <w:tcPr>
+            <w:tcW w:w="2237" w:type="dxa"/>
+          </w:tcPr>
+          <w:p>
+            <w:pPr>
+              <w:pStyle w:val="Ttulo3"/>
+              <w:ind w:left="0" w:firstLine="0"/>
+              <w:rPr>
+                <w:rFonts w:ascii="Times New Roman" w:hAnsi="Times New Roman" w:cs="Times New Roman"/>
+                <w:b/>
+                <w:bCs/>
+                <w:i/>
+                <w:iCs/>
+                <w:sz w:val="24"/>
+                <w:szCs w:val="24"/>
+              </w:rPr>
+            </w:pPr>
+            <w:r>
+              <w:rPr>
+                <w:rFonts w:ascii="Times New Roman" w:hAnsi="Times New Roman" w:cs="Times New Roman"/>
+                <w:b/>
+                <w:bCs/>
+                <w:i/>
+                <w:iCs/>
+                <w:sz w:val="24"/>
+                <w:szCs w:val="24"/>
+              </w:rPr>
+              <w:t>Phase</w:t>
+            </w:r>
+          </w:p>
+        </w:tc>
+        <w:tc>
+          <w:tcPr>
+            <w:tcW w:w="5145" w:type="dxa"/>
+          </w:tcPr>
+          <w:p>
+            <w:pPr>
+              <w:pStyle w:val="Ttulo3"/>
+              <w:ind w:left="0" w:firstLine="0"/>
+              <w:rPr>
+                <w:rFonts w:ascii="Times New Roman" w:hAnsi="Times New Roman" w:cs="Times New Roman"/>
+                <w:sz w:val="24"/>
+                <w:szCs w:val="24"/>
+              </w:rPr>
+            </w:pPr>
+            <w:r>
+              <w:rPr>
+                <w:rFonts w:ascii="Times New Roman" w:hAnsi="Times New Roman" w:cs="Times New Roman"/>
+                <w:sz w:val="24"/>
+                <w:szCs w:val="24"/>
+              </w:rPr>
+              <w:t>Representa uma fase antirrígida de uma classe que possui princípio de identidade.</w:t>
+            </w:r>
+          </w:p>
+        </w:tc>
+      </w:tr>
+      <w:tr>
+        <w:trPr>
+          <w:trHeight w:val="390"/>
+        </w:trPr>
+        <w:tc>
+          <w:tcPr>
+            <w:tcW w:w="2237" w:type="dxa"/>
+          </w:tcPr>
+          <w:p>
+            <w:pPr>
+              <w:pStyle w:val="Ttulo3"/>
+              <w:ind w:left="0" w:firstLine="0"/>
+              <w:rPr>
+                <w:rFonts w:ascii="Times New Roman" w:hAnsi="Times New Roman" w:cs="Times New Roman"/>
+                <w:b/>
+                <w:bCs/>
+                <w:i/>
+                <w:iCs/>
+                <w:sz w:val="24"/>
+                <w:szCs w:val="24"/>
+              </w:rPr>
+            </w:pPr>
+            <w:r>
+              <w:rPr>
+                <w:rFonts w:ascii="Times New Roman" w:hAnsi="Times New Roman" w:cs="Times New Roman"/>
+                <w:b/>
+                <w:bCs/>
+                <w:i/>
+                <w:iCs/>
+                <w:sz w:val="24"/>
+                <w:szCs w:val="24"/>
+              </w:rPr>
+              <w:t>Mode</w:t>
+            </w:r>
+          </w:p>
+        </w:tc>
+        <w:tc>
+          <w:tcPr>
+            <w:tcW w:w="5145" w:type="dxa"/>
+          </w:tcPr>
+          <w:p>
+            <w:pPr>
+              <w:pStyle w:val="Ttulo3"/>
+              <w:ind w:left="0" w:firstLine="0"/>
+              <w:rPr>
+                <w:rFonts w:ascii="Times New Roman" w:hAnsi="Times New Roman" w:cs="Times New Roman"/>
+                <w:sz w:val="24"/>
+                <w:szCs w:val="24"/>
+              </w:rPr>
+            </w:pPr>
+            <w:r>
+              <w:rPr>
+                <w:rFonts w:ascii="Times New Roman" w:hAnsi="Times New Roman" w:cs="Times New Roman"/>
+                <w:sz w:val="24"/>
+                <w:szCs w:val="24"/>
+              </w:rPr>
+              <w:t>Representa uma propriedade intrínseca existencialmente dependente de uma entidade.</w:t>
+            </w:r>
+          </w:p>
+        </w:tc>
+      </w:tr>
+      <w:tr>
+        <w:trPr>
+          <w:trHeight w:val="402"/>
+        </w:trPr>
+        <w:tc>
+          <w:tcPr>
+            <w:tcW w:w="2237" w:type="dxa"/>
+          </w:tcPr>
+          <w:p>
+            <w:pPr>
+              <w:pStyle w:val="Ttulo3"/>
+              <w:ind w:left="0" w:firstLine="0"/>
+              <w:rPr>
+                <w:rFonts w:ascii="Times New Roman" w:hAnsi="Times New Roman" w:cs="Times New Roman"/>
+                <w:b/>
+                <w:bCs/>
+                <w:i/>
+                <w:iCs/>
+                <w:sz w:val="24"/>
+                <w:szCs w:val="24"/>
+              </w:rPr>
+            </w:pPr>
+            <w:r>
+              <w:rPr>
+                <w:rFonts w:ascii="Times New Roman" w:hAnsi="Times New Roman" w:cs="Times New Roman"/>
+                <w:b/>
+                <w:bCs/>
+                <w:i/>
+                <w:iCs/>
+                <w:sz w:val="24"/>
+                <w:szCs w:val="24"/>
+              </w:rPr>
+              <w:t>Category</w:t>
+            </w:r>
+          </w:p>
+        </w:tc>
+        <w:tc>
+          <w:tcPr>
+            <w:tcW w:w="5145" w:type="dxa"/>
+          </w:tcPr>
+          <w:p>
+            <w:pPr>
+              <w:pStyle w:val="Ttulo3"/>
+              <w:ind w:left="0" w:firstLine="0"/>
+              <w:rPr>
+                <w:rFonts w:ascii="Times New Roman" w:hAnsi="Times New Roman" w:cs="Times New Roman"/>
+                <w:sz w:val="24"/>
+                <w:szCs w:val="24"/>
+              </w:rPr>
+            </w:pPr>
+            <w:r>
+              <w:rPr>
+                <w:rFonts w:ascii="Times New Roman" w:hAnsi="Times New Roman" w:cs="Times New Roman"/>
+                <w:sz w:val="24"/>
+                <w:szCs w:val="24"/>
+              </w:rPr>
+              <w:t>Agrega propriedades essenciais, mas não fornece princípio de identidade.</w:t>
+            </w:r>
+          </w:p>
+        </w:tc>
+      </w:tr>
+      <w:tr>
+        <w:trPr>
+          <w:trHeight w:val="402"/>
+        </w:trPr>
+        <w:tc>
+          <w:tcPr>
+            <w:tcW w:w="2237" w:type="dxa"/>
+          </w:tcPr>
+          <w:p>
+            <w:pPr>
+              <w:pStyle w:val="Ttulo3"/>
+              <w:ind w:left="0" w:firstLine="0"/>
+              <w:rPr>
+                <w:rFonts w:ascii="Times New Roman" w:hAnsi="Times New Roman" w:cs="Times New Roman"/>
+                <w:b/>
+                <w:bCs/>
+                <w:i/>
+                <w:iCs/>
+                <w:sz w:val="24"/>
+                <w:szCs w:val="24"/>
+              </w:rPr>
+            </w:pPr>
+            <w:r>
+              <w:rPr>
+                <w:rFonts w:ascii="Times New Roman" w:hAnsi="Times New Roman" w:cs="Times New Roman"/>
+                <w:b/>
+                <w:bCs/>
+                <w:i/>
+                <w:iCs/>
+                <w:sz w:val="24"/>
+                <w:szCs w:val="24"/>
+              </w:rPr>
+              <w:t>Mixin</w:t>
+            </w:r>
+          </w:p>
+        </w:tc>
+        <w:tc>
+          <w:tcPr>
+            <w:tcW w:w="5145" w:type="dxa"/>
+          </w:tcPr>
+          <w:p>
+            <w:pPr>
+              <w:pStyle w:val="Ttulo3"/>
+              <w:ind w:left="0" w:firstLine="0"/>
+              <w:rPr>
+                <w:rFonts w:ascii="Times New Roman" w:hAnsi="Times New Roman" w:cs="Times New Roman"/>
+                <w:sz w:val="24"/>
+                <w:szCs w:val="24"/>
+              </w:rPr>
+            </w:pPr>
+            <w:r>
+              <w:rPr>
+                <w:rFonts w:ascii="Times New Roman" w:hAnsi="Times New Roman" w:cs="Times New Roman"/>
+                <w:sz w:val="24"/>
+                <w:szCs w:val="24"/>
+              </w:rPr>
+              <w:t>Representa propriedades essenciais para algumas instâncias e ocasionais para outras.</w:t>
+            </w:r>
+          </w:p>
+        </w:tc>
+      </w:tr>
+      <w:tr>
+        <w:trPr>
+          <w:trHeight w:val="390"/>
+        </w:trPr>
+        <w:tc>
+          <w:tcPr>
+            <w:tcW w:w="2237" w:type="dxa"/>
+          </w:tcPr>
+          <w:p>
+            <w:pPr>
+              <w:pStyle w:val="Ttulo3"/>
+              <w:ind w:left="0" w:firstLine="0"/>
+              <w:rPr>
+                <w:rFonts w:ascii="Times New Roman" w:hAnsi="Times New Roman" w:cs="Times New Roman"/>
+                <w:b/>
+                <w:bCs/>
+                <w:i/>
+                <w:iCs/>
+                <w:sz w:val="24"/>
+                <w:szCs w:val="24"/>
+              </w:rPr>
+            </w:pPr>
+            <w:r>
+              <w:rPr>
+                <w:rFonts w:ascii="Times New Roman" w:hAnsi="Times New Roman" w:cs="Times New Roman"/>
+                <w:b/>
+                <w:bCs/>
+                <w:i/>
+                <w:iCs/>
+                <w:sz w:val="24"/>
+                <w:szCs w:val="24"/>
+              </w:rPr>
+              <w:t>RoleMixin</w:t>
+            </w:r>
+          </w:p>
+        </w:tc>
+        <w:tc>
+          <w:tcPr>
+            <w:tcW w:w="5145" w:type="dxa"/>
+          </w:tcPr>
+          <w:p>
+            <w:pPr>
+              <w:pStyle w:val="Ttulo3"/>
+              <w:ind w:left="0" w:firstLine="0"/>
+              <w:rPr>
+                <w:rFonts w:ascii="Times New Roman" w:hAnsi="Times New Roman" w:cs="Times New Roman"/>
+                <w:sz w:val="24"/>
+                <w:szCs w:val="24"/>
+              </w:rPr>
+            </w:pPr>
+            <w:r>
+              <w:rPr>
+                <w:rFonts w:ascii="Times New Roman" w:hAnsi="Times New Roman" w:cs="Times New Roman"/>
+                <w:sz w:val="24"/>
+                <w:szCs w:val="24"/>
+              </w:rPr>
+              <w:t>Representa um conceito antirrígido e relacionalmente dependente, aplicável a indivíduos com diferentes princípios de identidade.</w:t>
+            </w:r>
+          </w:p>
+        </w:tc>
+      </w:tr>
+      <w:tr>
+        <w:trPr>
+          <w:trHeight w:val="402"/>
+        </w:trPr>
+        <w:tc>
+          <w:tcPr>
+            <w:tcW w:w="2237" w:type="dxa"/>
+          </w:tcPr>
+          <w:p>
+            <w:pPr>
+              <w:pStyle w:val="Ttulo3"/>
+              <w:ind w:left="0" w:firstLine="0"/>
+              <w:rPr>
+                <w:rFonts w:ascii="Times New Roman" w:hAnsi="Times New Roman" w:cs="Times New Roman"/>
+                <w:b/>
+                <w:bCs/>
+                <w:i/>
+                <w:iCs/>
+                <w:sz w:val="24"/>
+                <w:szCs w:val="24"/>
+              </w:rPr>
+            </w:pPr>
+            <w:r>
+              <w:rPr>
+                <w:rFonts w:ascii="Times New Roman" w:hAnsi="Times New Roman" w:cs="Times New Roman"/>
+                <w:b/>
+                <w:bCs/>
+                <w:i/>
+                <w:iCs/>
+                <w:sz w:val="24"/>
+                <w:szCs w:val="24"/>
+              </w:rPr>
+              <w:t>Collective</w:t>
+            </w:r>
+          </w:p>
+        </w:tc>
+        <w:tc>
+          <w:tcPr>
+            <w:tcW w:w="5145" w:type="dxa"/>
+          </w:tcPr>
+          <w:p>
+            <w:pPr>
+              <w:pStyle w:val="Ttulo3"/>
+              <w:ind w:left="0" w:firstLine="0"/>
+              <w:rPr>
+                <w:rFonts w:ascii="Times New Roman" w:hAnsi="Times New Roman" w:cs="Times New Roman"/>
+                <w:sz w:val="24"/>
+                <w:szCs w:val="24"/>
+              </w:rPr>
+            </w:pPr>
+            <w:r>
+              <w:rPr>
+                <w:rFonts w:ascii="Times New Roman" w:hAnsi="Times New Roman" w:cs="Times New Roman"/>
+                <w:sz w:val="24"/>
+                <w:szCs w:val="24"/>
+              </w:rPr>
+              <w:t>Representa coleções de entidades, sem fornecer princípio de identidade próprio.</w:t>
+            </w:r>
+          </w:p>
+        </w:tc>
+      </w:tr>
+      <w:tr>
+        <w:trPr>
+          <w:trHeight w:val="390"/>
+        </w:trPr>
+        <w:tc>
+          <w:tcPr>
+            <w:tcW w:w="2237" w:type="dxa"/>
+          </w:tcPr>
+          <w:p>
+            <w:pPr>
+              <w:pStyle w:val="Ttulo3"/>
+              <w:ind w:left="0" w:firstLine="0"/>
+              <w:rPr>
+                <w:rFonts w:ascii="Times New Roman" w:hAnsi="Times New Roman" w:cs="Times New Roman"/>
+                <w:b/>
+                <w:bCs/>
+                <w:i/>
+                <w:iCs/>
+                <w:sz w:val="24"/>
+                <w:szCs w:val="24"/>
+              </w:rPr>
+            </w:pPr>
+            <w:r>
+              <w:rPr>
+                <w:rFonts w:ascii="Times New Roman" w:hAnsi="Times New Roman" w:cs="Times New Roman"/>
+                <w:b/>
+                <w:bCs/>
+                <w:i/>
+                <w:iCs/>
+                <w:sz w:val="24"/>
+                <w:szCs w:val="24"/>
+              </w:rPr>
+              <w:t>Quantity</w:t>
+            </w:r>
+          </w:p>
+        </w:tc>
+        <w:tc>
+          <w:tcPr>
+            <w:tcW w:w="5145" w:type="dxa"/>
+          </w:tcPr>
+          <w:p>
+            <w:pPr>
+              <w:pStyle w:val="Ttulo3"/>
+              <w:ind w:left="0" w:firstLine="0"/>
+              <w:rPr>
+                <w:rFonts w:ascii="Times New Roman" w:hAnsi="Times New Roman" w:cs="Times New Roman"/>
+                <w:sz w:val="24"/>
+                <w:szCs w:val="24"/>
+              </w:rPr>
+            </w:pPr>
+            <w:r>
+              <w:rPr>
+                <w:rFonts w:ascii="Times New Roman" w:hAnsi="Times New Roman" w:cs="Times New Roman"/>
+                <w:sz w:val="24"/>
+                <w:szCs w:val="24"/>
+              </w:rPr>
+              <w:t>Representa entidades de massa, como água, areia ou vinho.</w:t>
+            </w:r>
+          </w:p>
+        </w:tc>
+      </w:tr>
+      <w:tr>
+        <w:trPr>
+          <w:trHeight w:val="402"/>
+        </w:trPr>
+        <w:tc>
+          <w:tcPr>
+            <w:tcW w:w="2237" w:type="dxa"/>
+          </w:tcPr>
+          <w:p>
+            <w:pPr>
+              <w:pStyle w:val="Ttulo3"/>
+              <w:ind w:left="0" w:firstLine="0"/>
+              <w:rPr>
+                <w:rFonts w:ascii="Times New Roman" w:hAnsi="Times New Roman" w:cs="Times New Roman"/>
+                <w:b/>
+                <w:bCs/>
+                <w:i/>
+                <w:iCs/>
+                <w:sz w:val="24"/>
+                <w:szCs w:val="24"/>
+              </w:rPr>
+            </w:pPr>
+            <w:r>
+              <w:rPr>
+                <w:rFonts w:ascii="Times New Roman" w:hAnsi="Times New Roman" w:cs="Times New Roman"/>
+                <w:b/>
+                <w:bCs/>
+                <w:i/>
+                <w:iCs/>
+                <w:sz w:val="24"/>
+                <w:szCs w:val="24"/>
+              </w:rPr>
+              <w:t>Relator</w:t>
+            </w:r>
+          </w:p>
+        </w:tc>
+        <w:tc>
+          <w:tcPr>
+            <w:tcW w:w="5145" w:type="dxa"/>
+          </w:tcPr>
+          <w:p>
+            <w:pPr>
+              <w:pStyle w:val="Ttulo3"/>
+              <w:ind w:left="0" w:firstLine="0"/>
+              <w:rPr>
+                <w:rFonts w:ascii="Times New Roman" w:hAnsi="Times New Roman" w:cs="Times New Roman"/>
+                <w:sz w:val="24"/>
+                <w:szCs w:val="24"/>
+              </w:rPr>
+            </w:pPr>
+            <w:r>
+              <w:rPr>
+                <w:rFonts w:ascii="Times New Roman" w:hAnsi="Times New Roman" w:cs="Times New Roman"/>
+                <w:sz w:val="24"/>
+                <w:szCs w:val="24"/>
+              </w:rPr>
+              <w:t>Representa uma entidade relacional que fundamenta relações entre outras entidades.</w:t>
+            </w:r>
+          </w:p>
+        </w:tc>
+      </w:tr>
+    </w:tbl>
+    <w:p>
+      <w:pPr>
+        <w:pStyle w:val="Corpodetexto"/>
+        <w:jc w:val="center"/>
+      </w:pPr>
+      <w:r>
+        <w:t>Fonte: Adaptado de Guimarães et al. (2017).</w:t>
+      </w:r>
+    </w:p>
+    <w:p>
+      <w:pPr>
+        <w:pStyle w:val="Corpodetexto"/>
+        <w:jc w:val="center"/>
+      </w:pPr>
+    </w:p>
+    <w:p>
+      <w:pPr>
+        <w:pStyle w:val="Corpodetexto"/>
+        <w:spacing w:before="100"/>
+        <w:ind w:right="147" w:firstLine="272"/>
+        <w:jc w:val="both"/>
+      </w:pPr>
+      <w:r>
+        <w:t>Guimarães et al. (2017) apresentam os principais estereótipos de classes da linguagem OntoUML, os quais permitem distinguir a natureza ontológica dos conceitos representados em um modelo conceitual. O Quadro 1 sintetiza esses estereótipos e suas respectivas funções.</w:t>
+      </w:r>
+    </w:p>
+    <w:p>
+      <w:pPr>
+        <w:pStyle w:val="Corpodetexto"/>
+        <w:spacing w:before="100"/>
+        <w:ind w:right="147" w:firstLine="272"/>
+        <w:jc w:val="both"/>
+      </w:pPr>
+    </w:p>
+    <w:p>
+      <w:pPr>
+        <w:pStyle w:val="Corpodetexto"/>
+        <w:spacing w:before="100"/>
+        <w:ind w:right="147" w:firstLine="272"/>
+        <w:jc w:val="center"/>
+      </w:pPr>
+      <w:r>
+        <w:t>Quadro 2: Estereótipos de Relacionamentos da linguagem OntoUML.</w:t>
+      </w:r>
+    </w:p>
+    <w:tbl>
+      <w:tblPr>
+        <w:tblStyle w:val="Tabelacomgrade"/>
+        <w:tblW w:w="7349" w:type="dxa"/>
+        <w:tblInd w:w="980" w:type="dxa"/>
+        <w:tblLook w:val="04A0" w:firstRow="1" w:lastRow="0" w:firstColumn="1" w:lastColumn="0" w:noHBand="0" w:noVBand="1"/>
+      </w:tblPr>
+      <w:tblGrid>
+        <w:gridCol w:w="2276"/>
+        <w:gridCol w:w="5073"/>
+      </w:tblGrid>
+      <w:tr>
+        <w:trPr>
+          <w:trHeight w:val="312"/>
+        </w:trPr>
+        <w:tc>
+          <w:tcPr>
+            <w:tcW w:w="2276" w:type="dxa"/>
+          </w:tcPr>
+          <w:p>
+            <w:pPr>
+              <w:pStyle w:val="Corpodetexto"/>
+              <w:spacing w:before="100"/>
+              <w:ind w:right="147"/>
+              <w:rPr>
+                <w:b/>
+                <w:bCs/>
+              </w:rPr>
+            </w:pPr>
+            <w:r>
+              <w:rPr>
+                <w:b/>
+                <w:bCs/>
+              </w:rPr>
+              <w:t>Relação</w:t>
+            </w:r>
+          </w:p>
+        </w:tc>
+        <w:tc>
+          <w:tcPr>
+            <w:tcW w:w="5073" w:type="dxa"/>
+          </w:tcPr>
+          <w:p>
+            <w:pPr>
+              <w:pStyle w:val="Corpodetexto"/>
+              <w:spacing w:before="100"/>
+              <w:ind w:right="147"/>
+              <w:rPr>
+                <w:b/>
+                <w:bCs/>
+              </w:rPr>
+            </w:pPr>
+            <w:r>
+              <w:rPr>
+                <w:b/>
+                <w:bCs/>
+              </w:rPr>
+              <w:t>Descrição</w:t>
+            </w:r>
+          </w:p>
+        </w:tc>
+      </w:tr>
+      <w:tr>
+        <w:trPr>
+          <w:trHeight w:val="312"/>
+        </w:trPr>
+        <w:tc>
+          <w:tcPr>
+            <w:tcW w:w="2276" w:type="dxa"/>
+          </w:tcPr>
+          <w:p>
+            <w:pPr>
+              <w:pStyle w:val="Corpodetexto"/>
+              <w:spacing w:before="100"/>
+              <w:ind w:right="147"/>
+              <w:rPr>
+                <w:b/>
+                <w:bCs/>
+                <w:i/>
+                <w:iCs/>
+              </w:rPr>
+            </w:pPr>
+            <w:r>
+              <w:rPr>
+                <w:b/>
+                <w:bCs/>
+                <w:i/>
+                <w:iCs/>
+              </w:rPr>
+              <w:t>Mediação</w:t>
+            </w:r>
+            <w:r>
+              <w:rPr>
+                <w:b/>
+                <w:bCs/>
+                <w:i/>
+                <w:iCs/>
+              </w:rPr>
+              <w:t xml:space="preserve"> </w:t>
+            </w:r>
+            <w:r>
+              <w:rPr>
+                <w:b/>
+                <w:bCs/>
+                <w:i/>
+                <w:iCs/>
+              </w:rPr>
+              <w:t>(mediation)</w:t>
+            </w:r>
+          </w:p>
+        </w:tc>
+        <w:tc>
+          <w:tcPr>
+            <w:tcW w:w="5073" w:type="dxa"/>
+          </w:tcPr>
+          <w:p>
+            <w:pPr>
+              <w:pStyle w:val="Corpodetexto"/>
+              <w:spacing w:before="100"/>
+              <w:ind w:right="147"/>
+            </w:pPr>
+            <w:r>
+              <w:t>Representam um tipo de relação formal que relaciona um relator aos objetos que ele</w:t>
+            </w:r>
+            <w:r>
+              <w:t xml:space="preserve"> </w:t>
+            </w:r>
+            <w:r>
+              <w:t>media.</w:t>
+            </w:r>
+          </w:p>
+        </w:tc>
+      </w:tr>
+      <w:tr>
+        <w:trPr>
+          <w:trHeight w:val="301"/>
+        </w:trPr>
+        <w:tc>
+          <w:tcPr>
+            <w:tcW w:w="2276" w:type="dxa"/>
+          </w:tcPr>
+          <w:p>
+            <w:pPr>
+              <w:pStyle w:val="Corpodetexto"/>
+              <w:spacing w:before="100"/>
+              <w:ind w:right="147"/>
+              <w:rPr>
+                <w:b/>
+                <w:bCs/>
+                <w:i/>
+                <w:iCs/>
+              </w:rPr>
+            </w:pPr>
+            <w:r>
+              <w:rPr>
+                <w:b/>
+                <w:bCs/>
+                <w:i/>
+                <w:iCs/>
+              </w:rPr>
+              <w:t>Material</w:t>
+            </w:r>
+          </w:p>
+        </w:tc>
+        <w:tc>
+          <w:tcPr>
+            <w:tcW w:w="5073" w:type="dxa"/>
+          </w:tcPr>
+          <w:p>
+            <w:pPr>
+              <w:pStyle w:val="Corpodetexto"/>
+              <w:spacing w:before="100"/>
+              <w:ind w:right="147"/>
+            </w:pPr>
+            <w:r>
+              <w:t>Representa um tipo de relação que é induzida por um relator.</w:t>
+            </w:r>
+          </w:p>
+        </w:tc>
+      </w:tr>
+      <w:tr>
+        <w:trPr>
+          <w:trHeight w:val="312"/>
+        </w:trPr>
+        <w:tc>
+          <w:tcPr>
+            <w:tcW w:w="2276" w:type="dxa"/>
+          </w:tcPr>
+          <w:p>
+            <w:pPr>
+              <w:pStyle w:val="Corpodetexto"/>
+              <w:spacing w:before="100"/>
+              <w:ind w:right="147"/>
+              <w:rPr>
+                <w:b/>
+                <w:bCs/>
+                <w:i/>
+                <w:iCs/>
+              </w:rPr>
+            </w:pPr>
+            <w:r>
+              <w:rPr>
+                <w:b/>
+                <w:bCs/>
+                <w:i/>
+                <w:iCs/>
+              </w:rPr>
+              <w:t>Derivação</w:t>
+            </w:r>
+          </w:p>
+        </w:tc>
+        <w:tc>
+          <w:tcPr>
+            <w:tcW w:w="5073" w:type="dxa"/>
+          </w:tcPr>
+          <w:p>
+            <w:pPr>
+              <w:pStyle w:val="Corpodetexto"/>
+              <w:spacing w:before="100"/>
+              <w:ind w:right="147"/>
+            </w:pPr>
+            <w:r>
+              <w:t>Representa a relação formal de derivação que ocorre entre uma relação material do relator</w:t>
+            </w:r>
+            <w:r>
+              <w:t xml:space="preserve"> </w:t>
+            </w:r>
+            <w:r>
+              <w:t>que essa relação material é derivada.</w:t>
+            </w:r>
+          </w:p>
+        </w:tc>
+      </w:tr>
+      <w:tr>
+        <w:trPr>
+          <w:trHeight w:val="312"/>
+        </w:trPr>
+        <w:tc>
+          <w:tcPr>
+            <w:tcW w:w="2276" w:type="dxa"/>
+          </w:tcPr>
+          <w:p>
+            <w:pPr>
+              <w:pStyle w:val="Corpodetexto"/>
+              <w:spacing w:before="100"/>
+              <w:ind w:right="147"/>
+              <w:rPr>
+                <w:b/>
+                <w:bCs/>
+                <w:i/>
+                <w:iCs/>
+              </w:rPr>
+            </w:pPr>
+            <w:r>
+              <w:rPr>
+                <w:b/>
+                <w:bCs/>
+                <w:i/>
+                <w:iCs/>
+              </w:rPr>
+              <w:t>Caracterização</w:t>
+            </w:r>
+          </w:p>
+        </w:tc>
+        <w:tc>
+          <w:tcPr>
+            <w:tcW w:w="5073" w:type="dxa"/>
+          </w:tcPr>
+          <w:p>
+            <w:pPr>
+              <w:pStyle w:val="Corpodetexto"/>
+              <w:spacing w:before="100"/>
+              <w:ind w:right="147"/>
+            </w:pPr>
+            <w:r>
+              <w:t>Relação formal que ocorre entre um mode e a classe que este mode caracteriza</w:t>
+            </w:r>
+          </w:p>
+        </w:tc>
+      </w:tr>
+      <w:tr>
+        <w:trPr>
+          <w:trHeight w:val="312"/>
+        </w:trPr>
+        <w:tc>
+          <w:tcPr>
+            <w:tcW w:w="2276" w:type="dxa"/>
+          </w:tcPr>
+          <w:p>
+            <w:pPr>
+              <w:pStyle w:val="Corpodetexto"/>
+              <w:spacing w:before="100"/>
+              <w:ind w:right="147"/>
+              <w:rPr>
+                <w:b/>
+                <w:bCs/>
+                <w:i/>
+                <w:iCs/>
+              </w:rPr>
+            </w:pPr>
+            <w:r>
+              <w:rPr>
+                <w:b/>
+                <w:bCs/>
+                <w:i/>
+                <w:iCs/>
+              </w:rPr>
+              <w:t>Formal</w:t>
+            </w:r>
+          </w:p>
+        </w:tc>
+        <w:tc>
+          <w:tcPr>
+            <w:tcW w:w="5073" w:type="dxa"/>
+          </w:tcPr>
+          <w:p>
+            <w:pPr>
+              <w:pStyle w:val="Corpodetexto"/>
+              <w:spacing w:before="100"/>
+              <w:ind w:right="147"/>
+            </w:pPr>
+            <w:r>
+              <w:t>Representa uma relação formal, ou seja, uma relação de comparação a partir de</w:t>
+            </w:r>
+            <w:r>
+              <w:t xml:space="preserve"> </w:t>
+            </w:r>
+            <w:r>
+              <w:t>propriedades intrínsecas das classes relacionadas, ou uma relação interna</w:t>
+            </w:r>
+          </w:p>
+        </w:tc>
+      </w:tr>
+      <w:tr>
+        <w:trPr>
+          <w:trHeight w:val="312"/>
+        </w:trPr>
+        <w:tc>
+          <w:tcPr>
+            <w:tcW w:w="2276" w:type="dxa"/>
+          </w:tcPr>
+          <w:p>
+            <w:pPr>
+              <w:pStyle w:val="Corpodetexto"/>
+              <w:spacing w:before="100"/>
+              <w:ind w:right="147"/>
+              <w:rPr>
+                <w:b/>
+                <w:bCs/>
+                <w:i/>
+                <w:iCs/>
+              </w:rPr>
+            </w:pPr>
+            <w:r>
+              <w:rPr>
+                <w:b/>
+                <w:bCs/>
+                <w:i/>
+                <w:iCs/>
+              </w:rPr>
+              <w:t>Componentof</w:t>
+            </w:r>
+          </w:p>
+        </w:tc>
+        <w:tc>
+          <w:tcPr>
+            <w:tcW w:w="5073" w:type="dxa"/>
+          </w:tcPr>
+          <w:p>
+            <w:pPr>
+              <w:pStyle w:val="Corpodetexto"/>
+              <w:spacing w:before="100"/>
+              <w:ind w:right="147"/>
+            </w:pPr>
+            <w:r>
+              <w:t>Representa uma composição funcional. é uma relação todo-parte entre dois complexos</w:t>
+            </w:r>
+            <w:r>
+              <w:t xml:space="preserve"> </w:t>
+            </w:r>
+            <w:r>
+              <w:lastRenderedPageBreak/>
+              <w:t>funcionais (kind ou um subtipo de um kind).</w:t>
+            </w:r>
+          </w:p>
+        </w:tc>
+      </w:tr>
+      <w:tr>
+        <w:trPr>
+          <w:trHeight w:val="312"/>
+        </w:trPr>
+        <w:tc>
+          <w:tcPr>
+            <w:tcW w:w="2276" w:type="dxa"/>
+          </w:tcPr>
+          <w:p>
+            <w:pPr>
+              <w:pStyle w:val="Corpodetexto"/>
+              <w:spacing w:before="100"/>
+              <w:ind w:right="147"/>
+              <w:rPr>
+                <w:b/>
+                <w:bCs/>
+                <w:i/>
+                <w:iCs/>
+              </w:rPr>
+            </w:pPr>
+            <w:r>
+              <w:rPr>
+                <w:b/>
+                <w:bCs/>
+                <w:i/>
+                <w:iCs/>
+              </w:rPr>
+              <w:lastRenderedPageBreak/>
+              <w:t>Memberof</w:t>
+            </w:r>
+          </w:p>
+        </w:tc>
+        <w:tc>
+          <w:tcPr>
+            <w:tcW w:w="5073" w:type="dxa"/>
+          </w:tcPr>
+          <w:p>
+            <w:pPr>
+              <w:pStyle w:val="Corpodetexto"/>
+              <w:spacing w:before="100"/>
+              <w:ind w:right="147"/>
+            </w:pPr>
+            <w:r>
+              <w:t>Uma relação todo-parte e existe para relacionar membros a conjuntos</w:t>
+            </w:r>
+          </w:p>
+        </w:tc>
+      </w:tr>
+      <w:tr>
+        <w:trPr>
+          <w:trHeight w:val="301"/>
+        </w:trPr>
+        <w:tc>
+          <w:tcPr>
+            <w:tcW w:w="2276" w:type="dxa"/>
+          </w:tcPr>
+          <w:p>
+            <w:pPr>
+              <w:pStyle w:val="Corpodetexto"/>
+              <w:spacing w:before="100"/>
+              <w:ind w:right="147"/>
+              <w:rPr>
+                <w:b/>
+                <w:bCs/>
+                <w:i/>
+                <w:iCs/>
+              </w:rPr>
+            </w:pPr>
+            <w:r>
+              <w:rPr>
+                <w:b/>
+                <w:bCs/>
+                <w:i/>
+                <w:iCs/>
+              </w:rPr>
+              <w:t>SubCollectionOf</w:t>
+            </w:r>
+          </w:p>
+        </w:tc>
+        <w:tc>
+          <w:tcPr>
+            <w:tcW w:w="5073" w:type="dxa"/>
+          </w:tcPr>
+          <w:p>
+            <w:pPr>
+              <w:pStyle w:val="Corpodetexto"/>
+              <w:spacing w:before="100"/>
+              <w:ind w:right="147"/>
+            </w:pPr>
+            <w:r>
+              <w:t>Uma relação todo parte que explicita relações de subgrupo entre collectives</w:t>
+            </w:r>
+          </w:p>
+        </w:tc>
+      </w:tr>
+    </w:tbl>
+    <w:p>
+      <w:pPr>
+        <w:pStyle w:val="Corpodetexto"/>
+        <w:jc w:val="center"/>
+      </w:pPr>
+      <w:r>
+        <w:t>Fonte: Adaptado de Guimarães et al. (2017).</w:t>
+      </w:r>
+    </w:p>
+    <w:p>
+      <w:pPr>
+        <w:pStyle w:val="Corpodetexto"/>
+        <w:spacing w:before="100"/>
+        <w:ind w:right="147" w:firstLine="272"/>
+        <w:jc w:val="center"/>
+      </w:pPr>
+    </w:p>
+    <w:p>
+      <w:pPr>
+        <w:pStyle w:val="pdq2pgselectionanchorcontainer"/>
+        <w:ind w:firstLine="272"/>
+      </w:pPr>
+      <w:r>
+        <w:t>Essa distinção entre tipos, papéis e relações é especialmente relevante para a modelagem jurídica. Conforme Griffo (2018), a construção de ontologias jurídicas exige atenção às relações jurídicas e aos papéis exercidos por agentes dentro de estruturas normativas. Desse modo, a OntoUML contribui para representar o Direito de forma mais precisa, pois permite diferenciar uma entidade que possui identidade própria, como uma pessoa ou organização, dos papéis que ela pode exercer em determinado processo, como autor, réu, advogado, perito ou testemunha. A tese de Griffo, inclusive, apresenta a UFO-L como uma ontologia núcleo jurídica construída sob a perspectiva das relações jurídicas, reforçando a importância de uma modelagem juridicamente fundamentada</w:t>
+      </w:r>
+      <w:r>
+        <w:t>.</w:t>
+      </w:r>
+    </w:p>
+    <w:p>
+      <w:pPr>
+        <w:pStyle w:val="Corpodetexto"/>
+        <w:spacing w:before="100"/>
+        <w:ind w:right="147" w:firstLine="272"/>
+        <w:jc w:val="both"/>
         <w:sectPr>
           <w:pgSz w:w="11910" w:h="16840"/>
           <w:pgMar w:top="1260" w:right="992" w:bottom="280" w:left="1417" w:header="994" w:footer="0" w:gutter="0"/>
           <w:cols w:space="720"/>
         </w:sectPr>
       </w:pPr>
+      <w:r>
+        <w:t>A utilização da OntoUML também se relaciona ao método de desenvolvimento de ontologias adotado neste trabalho. Falbo (2014), ao propor a SABiO, diferencia ontologias de referência e ontologias operacionais, indicando que as ontologias de referência possuem foco na representação conceitual do domínio. Nesse sentido, a OntoUML é adequada para a construção da ontologia proposta, pois permite elaborar um modelo conceitual independente de uma implementação computacional específica, servindo como base para posteriores transformações em ontologias operacionais ou sistemas de apoio jurídico.</w:t>
+      </w:r>
+      <w:bookmarkStart w:id="25" w:name="_GoBack"/>
+      <w:bookmarkEnd w:id="25"/>
     </w:p>
     <w:p>
       <w:pPr>
@@ -11737,8 +13417,8 @@
         <w:spacing w:line="312" w:lineRule="auto"/>
         <w:jc w:val="both"/>
         <w:sectPr>
-          <w:headerReference w:type="even" r:id="rId24"/>
-          <w:headerReference w:type="default" r:id="rId25"/>
+          <w:headerReference w:type="even" r:id="rId27"/>
+          <w:headerReference w:type="default" r:id="rId28"/>
           <w:pgSz w:w="11910" w:h="16840"/>
           <w:pgMar w:top="1260" w:right="992" w:bottom="280" w:left="1417" w:header="994" w:footer="0" w:gutter="0"/>
           <w:cols w:space="720"/>
@@ -13204,7 +14884,7 @@
         </w:rPr>
         <w:t xml:space="preserve">X, você pode consultar a </w:t>
       </w:r>
-      <w:hyperlink r:id="rId26">
+      <w:hyperlink r:id="rId29">
         <w:r>
           <w:rPr>
             <w:color w:val="2805C3"/>
@@ -13226,7 +14906,7 @@
         </w:rPr>
         <w:t xml:space="preserve">ou vários materiais disponíveis online, como </w:t>
       </w:r>
-      <w:hyperlink r:id="rId27">
+      <w:hyperlink r:id="rId30">
         <w:r>
           <w:rPr>
             <w:color w:val="2805C3"/>
@@ -13242,7 +14922,7 @@
         </w:rPr>
         <w:t xml:space="preserve"> </w:t>
       </w:r>
-      <w:hyperlink r:id="rId28">
+      <w:hyperlink r:id="rId31">
         <w:r>
           <w:rPr>
             <w:color w:val="2805C3"/>
@@ -16315,8 +17995,8 @@
         <w:spacing w:line="312" w:lineRule="auto"/>
         <w:jc w:val="both"/>
         <w:sectPr>
-          <w:headerReference w:type="even" r:id="rId29"/>
-          <w:headerReference w:type="default" r:id="rId30"/>
+          <w:headerReference w:type="even" r:id="rId32"/>
+          <w:headerReference w:type="default" r:id="rId33"/>
           <w:pgSz w:w="11910" w:h="16840"/>
           <w:pgMar w:top="1300" w:right="992" w:bottom="280" w:left="1417" w:header="994" w:footer="0" w:gutter="0"/>
           <w:cols w:space="720"/>
@@ -21547,7 +23227,7 @@
         </w:rPr>
         <w:t xml:space="preserve"> </w:t>
       </w:r>
-      <w:hyperlink r:id="rId31">
+      <w:hyperlink r:id="rId34">
         <w:r>
           <w:rPr>
             <w:rFonts w:ascii="Georgia"/>
@@ -25055,7 +26735,7 @@
         <w:ind w:left="282" w:right="146" w:hanging="13"/>
         <w:jc w:val="both"/>
       </w:pPr>
-      <w:hyperlink r:id="rId32">
+      <w:hyperlink r:id="rId35">
         <w:r>
           <w:rPr>
             <w:rFonts w:ascii="Georgia" w:hAnsi="Georgia"/>
@@ -25078,7 +26758,7 @@
       <w:r>
         <w:t xml:space="preserve"> </w:t>
       </w:r>
-      <w:hyperlink r:id="rId33">
+      <w:hyperlink r:id="rId36">
         <w:r>
           <w:rPr>
             <w:w w:val="110"/>
@@ -25185,7 +26865,7 @@
         <w:ind w:left="282" w:right="97" w:firstLine="737"/>
         <w:jc w:val="both"/>
       </w:pPr>
-      <w:hyperlink r:id="rId34">
+      <w:hyperlink r:id="rId37">
         <w:r>
           <w:rPr>
             <w:w w:val="110"/>
@@ -25212,7 +26892,7 @@
         </w:rPr>
         <w:t xml:space="preserve"> </w:t>
       </w:r>
-      <w:hyperlink r:id="rId35">
+      <w:hyperlink r:id="rId38">
         <w:r>
           <w:rPr>
             <w:w w:val="110"/>
@@ -25384,7 +27064,7 @@
         </w:rPr>
         <w:t xml:space="preserve"> </w:t>
       </w:r>
-      <w:hyperlink r:id="rId36">
+      <w:hyperlink r:id="rId39">
         <w:r>
           <w:t>uma melhor organização aos arquivos. Ao abrir esta pasta, repare que as figuras possuem</w:t>
         </w:r>
@@ -25396,7 +27076,7 @@
         </w:rPr>
         <w:t xml:space="preserve"> </w:t>
       </w:r>
-      <w:hyperlink r:id="rId37">
+      <w:hyperlink r:id="rId40">
         <w:r>
           <w:rPr>
             <w:w w:val="110"/>
@@ -25444,7 +27124,7 @@
         </w:rPr>
         <w:t xml:space="preserve"> </w:t>
       </w:r>
-      <w:hyperlink r:id="rId38">
+      <w:hyperlink r:id="rId41">
         <w:r>
           <w:t>não especifica a extensão. Isso se dá porque o L</w:t>
         </w:r>
@@ -25472,7 +27152,7 @@
       <w:r>
         <w:t xml:space="preserve"> </w:t>
       </w:r>
-      <w:hyperlink r:id="rId39">
+      <w:hyperlink r:id="rId42">
         <w:r>
           <w:rPr>
             <w:spacing w:val="-2"/>
@@ -25702,7 +27382,7 @@
         </w:rPr>
         <w:t xml:space="preserve"> </w:t>
       </w:r>
-      <w:hyperlink r:id="rId40">
+      <w:hyperlink r:id="rId43">
         <w:r>
           <w:rPr>
             <w:spacing w:val="-2"/>
@@ -25940,7 +27620,7 @@
         </w:rPr>
         <w:t xml:space="preserve"> </w:t>
       </w:r>
-      <w:hyperlink r:id="rId41">
+      <w:hyperlink r:id="rId44">
         <w:r>
           <w:t>colocar as figuras em formatos mais comuns, como JPG ou PNG e ele incluir no PDF sem</w:t>
         </w:r>
@@ -25948,7 +27628,7 @@
       <w:r>
         <w:t xml:space="preserve"> </w:t>
       </w:r>
-      <w:hyperlink r:id="rId42">
+      <w:hyperlink r:id="rId45">
         <w:r>
           <w:rPr>
             <w:w w:val="110"/>
@@ -25964,7 +27644,7 @@
         <w:ind w:left="282" w:right="146" w:firstLine="737"/>
         <w:jc w:val="both"/>
       </w:pPr>
-      <w:hyperlink r:id="rId43">
+      <w:hyperlink r:id="rId46">
         <w:r>
           <w:rPr>
             <w:w w:val="105"/>
@@ -26004,7 +27684,7 @@
         </w:rPr>
         <w:t xml:space="preserve"> </w:t>
       </w:r>
-      <w:hyperlink r:id="rId44">
+      <w:hyperlink r:id="rId47">
         <w:r>
           <w:rPr>
             <w:w w:val="105"/>
@@ -26018,7 +27698,7 @@
         </w:rPr>
         <w:t xml:space="preserve"> </w:t>
       </w:r>
-      <w:hyperlink r:id="rId45">
+      <w:hyperlink r:id="rId48">
         <w:r>
           <w:rPr>
             <w:w w:val="105"/>
@@ -26032,7 +27712,7 @@
         </w:rPr>
         <w:t xml:space="preserve"> </w:t>
       </w:r>
-      <w:hyperlink r:id="rId46">
+      <w:hyperlink r:id="rId49">
         <w:r>
           <w:rPr>
             <w:w w:val="105"/>
@@ -26061,7 +27741,7 @@
         <w:ind w:left="282" w:right="146" w:firstLine="737"/>
         <w:jc w:val="both"/>
       </w:pPr>
-      <w:hyperlink r:id="rId47">
+      <w:hyperlink r:id="rId50">
         <w:r>
           <w:rPr>
             <w:w w:val="110"/>
@@ -26106,7 +27786,7 @@
         </w:rPr>
         <w:t xml:space="preserve"> </w:t>
       </w:r>
-      <w:hyperlink r:id="rId48">
+      <w:hyperlink r:id="rId51">
         <w:r>
           <w:rPr>
             <w:w w:val="110"/>
@@ -26138,7 +27818,7 @@
         </w:rPr>
         <w:t xml:space="preserve"> </w:t>
       </w:r>
-      <w:hyperlink r:id="rId49">
+      <w:hyperlink r:id="rId52">
         <w:r>
           <w:rPr>
             <w:w w:val="110"/>
@@ -26240,7 +27920,7 @@
           <w:t>6.3</w:t>
         </w:r>
       </w:hyperlink>
-      <w:hyperlink r:id="rId50">
+      <w:hyperlink r:id="rId53">
         <w:r>
           <w:rPr>
             <w:w w:val="110"/>
@@ -26290,7 +27970,7 @@
           <w:t>2</w:t>
         </w:r>
       </w:hyperlink>
-      <w:hyperlink r:id="rId51">
+      <w:hyperlink r:id="rId54">
         <w:r>
           <w:rPr>
             <w:w w:val="110"/>
@@ -26317,7 +27997,7 @@
         </w:rPr>
         <w:t xml:space="preserve"> </w:t>
       </w:r>
-      <w:hyperlink r:id="rId52">
+      <w:hyperlink r:id="rId55">
         <w:r>
           <w:t xml:space="preserve">particular, utiliza o pacote </w:t>
         </w:r>
@@ -26334,7 +28014,7 @@
       <w:r>
         <w:t xml:space="preserve"> </w:t>
       </w:r>
-      <w:hyperlink r:id="rId53">
+      <w:hyperlink r:id="rId56">
         <w:r>
           <w:rPr>
             <w:w w:val="110"/>
@@ -26387,7 +28067,7 @@
         </w:tabs>
         <w:ind w:left="1019" w:hanging="737"/>
       </w:pPr>
-      <w:hyperlink r:id="rId54" w:anchor="Supported_languages">
+      <w:hyperlink r:id="rId57" w:anchor="Supported_languages">
         <w:r>
           <w:rPr>
             <w:spacing w:val="-2"/>
@@ -26403,7 +28083,7 @@
         <w:ind w:left="282" w:right="105" w:firstLine="737"/>
         <w:jc w:val="both"/>
       </w:pPr>
-      <w:hyperlink r:id="rId55">
+      <w:hyperlink r:id="rId58">
         <w:r>
           <w:t>Tabelas são um ponto fraco do L</w:t>
         </w:r>
@@ -26431,7 +28111,7 @@
       <w:r>
         <w:t xml:space="preserve"> </w:t>
       </w:r>
-      <w:hyperlink r:id="rId56">
+      <w:hyperlink r:id="rId59">
         <w:r>
           <w:t>da</w:t>
         </w:r>
@@ -26547,7 +28227,7 @@
       <w:r>
         <w:t xml:space="preserve"> </w:t>
       </w:r>
-      <w:hyperlink r:id="rId57">
+      <w:hyperlink r:id="rId60">
         <w:r>
           <w:t>documento como figuras. Mostramos, no entanto, alguns exemplos de tabela a seguir. O</w:t>
         </w:r>
@@ -26555,7 +28235,7 @@
       <w:r>
         <w:t xml:space="preserve"> </w:t>
       </w:r>
-      <w:hyperlink r:id="rId58">
+      <w:hyperlink r:id="rId61">
         <w:r>
           <w:t>código</w:t>
         </w:r>
@@ -26646,7 +28326,7 @@
           <w:t>6.4</w:t>
         </w:r>
       </w:hyperlink>
-      <w:hyperlink r:id="rId59">
+      <w:hyperlink r:id="rId62">
         <w:r>
           <w:t>,</w:t>
         </w:r>
@@ -26672,7 +28352,7 @@
         </w:rPr>
         <w:t xml:space="preserve"> </w:t>
       </w:r>
-      <w:hyperlink r:id="rId60">
+      <w:hyperlink r:id="rId63">
         <w:r>
           <w:t>e</w:t>
         </w:r>
@@ -26691,7 +28371,7 @@
           <w:t>6.6</w:t>
         </w:r>
       </w:hyperlink>
-      <w:hyperlink r:id="rId61">
+      <w:hyperlink r:id="rId64">
         <w:r>
           <w:t>.</w:t>
         </w:r>
@@ -26715,7 +28395,7 @@
           <w:sz w:val="20"/>
         </w:rPr>
       </w:pPr>
-      <w:hyperlink r:id="rId62">
+      <w:hyperlink r:id="rId65">
         <w:r>
           <w:rPr>
             <w:rFonts w:ascii="Georgia"/>
@@ -49337,7 +51017,7 @@
                     <pic:cNvPicPr/>
                   </pic:nvPicPr>
                   <pic:blipFill>
-                    <a:blip r:embed="rId63"/>
+                    <a:blip r:embed="rId66"/>
                     <a:stretch>
                       <a:fillRect/>
                     </a:stretch>
@@ -52006,7 +53686,7 @@
       <w:pPr>
         <w:pStyle w:val="Corpodetexto"/>
         <w:sectPr>
-          <w:headerReference w:type="default" r:id="rId64"/>
+          <w:headerReference w:type="default" r:id="rId67"/>
           <w:pgSz w:w="16840" w:h="11910" w:orient="landscape"/>
           <w:pgMar w:top="1340" w:right="2409" w:bottom="280" w:left="2409" w:header="0" w:footer="0" w:gutter="0"/>
           <w:cols w:space="720"/>
@@ -55214,8 +56894,8 @@
           <w:sz w:val="16"/>
         </w:rPr>
         <w:sectPr>
-          <w:headerReference w:type="even" r:id="rId65"/>
-          <w:headerReference w:type="default" r:id="rId66"/>
+          <w:headerReference w:type="even" r:id="rId68"/>
+          <w:headerReference w:type="default" r:id="rId69"/>
           <w:pgSz w:w="11910" w:h="16840"/>
           <w:pgMar w:top="1380" w:right="992" w:bottom="280" w:left="1559" w:header="994" w:footer="0" w:gutter="0"/>
           <w:cols w:space="720"/>
@@ -56426,7 +58106,7 @@
         </w:rPr>
         <w:t xml:space="preserve">Experience (online first: </w:t>
       </w:r>
-      <w:hyperlink r:id="rId67">
+      <w:hyperlink r:id="rId70">
         <w:r>
           <w:rPr>
             <w:rFonts w:ascii="Palatino Linotype" w:hAnsi="Palatino Linotype"/>
@@ -56664,9 +58344,9 @@
       <w:bookmarkEnd w:id="70"/>
     </w:p>
     <w:sectPr>
-      <w:headerReference w:type="even" r:id="rId68"/>
-      <w:headerReference w:type="default" r:id="rId69"/>
-      <w:footerReference w:type="even" r:id="rId70"/>
+      <w:headerReference w:type="even" r:id="rId71"/>
+      <w:headerReference w:type="default" r:id="rId72"/>
+      <w:footerReference w:type="even" r:id="rId73"/>
       <w:pgSz w:w="11910" w:h="16840"/>
       <w:pgMar w:top="1920" w:right="992" w:bottom="280" w:left="1559" w:header="0" w:footer="0" w:gutter="0"/>
       <w:cols w:space="720"/>
@@ -60928,6 +62608,26 @@
       <w:szCs w:val="28"/>
     </w:rPr>
   </w:style>
+  <w:style w:type="paragraph" w:styleId="Ttulo5">
+    <w:name w:val="heading 5"/>
+    <w:basedOn w:val="Normal"/>
+    <w:next w:val="Normal"/>
+    <w:link w:val="Ttulo5Char"/>
+    <w:uiPriority w:val="9"/>
+    <w:unhideWhenUsed/>
+    <w:qFormat/>
+    <w:rsid w:val="00433439"/>
+    <w:pPr>
+      <w:keepNext/>
+      <w:keepLines/>
+      <w:spacing w:before="40"/>
+      <w:outlineLvl w:val="4"/>
+    </w:pPr>
+    <w:rPr>
+      <w:rFonts w:asciiTheme="majorHAnsi" w:eastAsiaTheme="majorEastAsia" w:hAnsiTheme="majorHAnsi" w:cstheme="majorBidi"/>
+      <w:color w:val="365F91" w:themeColor="accent1" w:themeShade="BF"/>
+    </w:rPr>
+  </w:style>
   <w:style w:type="character" w:default="1" w:styleId="Fontepargpadro">
     <w:name w:val="Default Paragraph Font"/>
     <w:uiPriority w:val="1"/>
@@ -61035,6 +62735,69 @@
       <w:iCs/>
     </w:rPr>
   </w:style>
+  <w:style w:type="character" w:customStyle="1" w:styleId="Ttulo5Char">
+    <w:name w:val="Título 5 Char"/>
+    <w:basedOn w:val="Fontepargpadro"/>
+    <w:link w:val="Ttulo5"/>
+    <w:uiPriority w:val="9"/>
+    <w:rsid w:val="00433439"/>
+    <w:rPr>
+      <w:rFonts w:asciiTheme="majorHAnsi" w:eastAsiaTheme="majorEastAsia" w:hAnsiTheme="majorHAnsi" w:cstheme="majorBidi"/>
+      <w:color w:val="365F91" w:themeColor="accent1" w:themeShade="BF"/>
+      <w:lang w:val="pt-PT"/>
+    </w:rPr>
+  </w:style>
+  <w:style w:type="table" w:styleId="Tabelacomgrade">
+    <w:name w:val="Table Grid"/>
+    <w:basedOn w:val="Tabelanormal"/>
+    <w:uiPriority w:val="39"/>
+    <w:rsid w:val="005A14BF"/>
+    <w:tblPr>
+      <w:tblBorders>
+        <w:top w:val="single" w:sz="4" w:space="0" w:color="auto"/>
+        <w:left w:val="single" w:sz="4" w:space="0" w:color="auto"/>
+        <w:bottom w:val="single" w:sz="4" w:space="0" w:color="auto"/>
+        <w:right w:val="single" w:sz="4" w:space="0" w:color="auto"/>
+        <w:insideH w:val="single" w:sz="4" w:space="0" w:color="auto"/>
+        <w:insideV w:val="single" w:sz="4" w:space="0" w:color="auto"/>
+      </w:tblBorders>
+    </w:tblPr>
+  </w:style>
+  <w:style w:type="paragraph" w:customStyle="1" w:styleId="pdq2pgselectionanchorcontainer">
+    <w:name w:val="pdq2pg_selectionanchorcontainer"/>
+    <w:basedOn w:val="Normal"/>
+    <w:rsid w:val="00BA3022"/>
+    <w:pPr>
+      <w:widowControl/>
+      <w:autoSpaceDE/>
+      <w:autoSpaceDN/>
+      <w:spacing w:before="100" w:beforeAutospacing="1" w:after="100" w:afterAutospacing="1"/>
+    </w:pPr>
+    <w:rPr>
+      <w:sz w:val="24"/>
+      <w:szCs w:val="24"/>
+      <w:lang w:val="pt-BR" w:eastAsia="pt-BR"/>
+    </w:rPr>
+  </w:style>
+  <w:style w:type="paragraph" w:styleId="NormalWeb">
+    <w:name w:val="Normal (Web)"/>
+    <w:basedOn w:val="Normal"/>
+    <w:uiPriority w:val="99"/>
+    <w:semiHidden/>
+    <w:unhideWhenUsed/>
+    <w:rsid w:val="00BA3022"/>
+    <w:pPr>
+      <w:widowControl/>
+      <w:autoSpaceDE/>
+      <w:autoSpaceDN/>
+      <w:spacing w:before="100" w:beforeAutospacing="1" w:after="100" w:afterAutospacing="1"/>
+    </w:pPr>
+    <w:rPr>
+      <w:sz w:val="24"/>
+      <w:szCs w:val="24"/>
+      <w:lang w:val="pt-BR" w:eastAsia="pt-BR"/>
+    </w:rPr>
+  </w:style>
 </w:styles>
 </file>
 
@@ -61086,7 +62849,7 @@
     <w:charset w:val="00"/>
     <w:family w:val="roman"/>
     <w:pitch w:val="variable"/>
-    <w:sig w:usb0="E0002AFF" w:usb1="C0007843" w:usb2="00000009" w:usb3="00000000" w:csb0="000001FF" w:csb1="00000000"/>
+    <w:sig w:usb0="E0002EFF" w:usb1="C000785B" w:usb2="00000009" w:usb3="00000000" w:csb0="000001FF" w:csb1="00000000"/>
   </w:font>
   <w:font w:name="Palatino Linotype">
     <w:panose1 w:val="02040502050505030304"/>
@@ -61100,7 +62863,7 @@
     <w:charset w:val="00"/>
     <w:family w:val="swiss"/>
     <w:pitch w:val="variable"/>
-    <w:sig w:usb0="E0002AFF" w:usb1="C0007843" w:usb2="00000009" w:usb3="00000000" w:csb0="000001FF" w:csb1="00000000"/>
+    <w:sig w:usb0="E0002EFF" w:usb1="C000785B" w:usb2="00000009" w:usb3="00000000" w:csb0="000001FF" w:csb1="00000000"/>
   </w:font>
   <w:font w:name="Tahoma">
     <w:altName w:val="Tahoma"/>
@@ -61123,7 +62886,14 @@
     <w:charset w:val="00"/>
     <w:family w:val="swiss"/>
     <w:pitch w:val="variable"/>
-    <w:sig w:usb0="E00002FF" w:usb1="4000ACFF" w:usb2="00000001" w:usb3="00000000" w:csb0="0000019F" w:csb1="00000000"/>
+    <w:sig w:usb0="E4002EFF" w:usb1="C200247B" w:usb2="00000009" w:usb3="00000000" w:csb0="000001FF" w:csb1="00000000"/>
+  </w:font>
+  <w:font w:name="Cambria">
+    <w:panose1 w:val="02040503050406030204"/>
+    <w:charset w:val="00"/>
+    <w:family w:val="roman"/>
+    <w:pitch w:val="variable"/>
+    <w:sig w:usb0="E00006FF" w:usb1="420024FF" w:usb2="02000000" w:usb3="00000000" w:csb0="0000019F" w:csb1="00000000"/>
   </w:font>
   <w:font w:name="Roboto">
     <w:altName w:val="Arial"/>
@@ -61139,19 +62909,12 @@
     <w:pitch w:val="variable"/>
     <w:sig w:usb0="80000AFF" w:usb1="0000396B" w:usb2="00000000" w:usb3="00000000" w:csb0="000000BF" w:csb1="00000000"/>
   </w:font>
-  <w:font w:name="Cambria">
-    <w:panose1 w:val="02040503050406030204"/>
-    <w:charset w:val="00"/>
-    <w:family w:val="roman"/>
-    <w:pitch w:val="variable"/>
-    <w:sig w:usb0="A00002EF" w:usb1="4000004B" w:usb2="00000000" w:usb3="00000000" w:csb0="0000009F" w:csb1="00000000"/>
-  </w:font>
   <w:font w:name="Calibri Light">
     <w:panose1 w:val="020F0302020204030204"/>
     <w:charset w:val="00"/>
     <w:family w:val="swiss"/>
     <w:pitch w:val="variable"/>
-    <w:sig w:usb0="A00002EF" w:usb1="4000207B" w:usb2="00000000" w:usb3="00000000" w:csb0="0000009F" w:csb1="00000000"/>
+    <w:sig w:usb0="E4002EFF" w:usb1="C200247B" w:usb2="00000009" w:usb3="00000000" w:csb0="000001FF" w:csb1="00000000"/>
   </w:font>
 </w:fonts>
 </file>
@@ -61174,7 +62937,9 @@
   <w:rsids>
     <w:rsidRoot w:val="000040FF"/>
     <w:rsid w:val="000040FF"/>
+    <w:rsid w:val="00033E4B"/>
     <w:rsid w:val="00452E91"/>
+    <w:rsid w:val="00690207"/>
     <w:rsid w:val="009D5B87"/>
     <w:rsid w:val="00DE37A6"/>
     <w:rsid w:val="00E30DFA"/>
@@ -61954,7 +63719,7 @@
 </file>
 
 <file path=customXml/itemProps1.xml><?xml version="1.0" encoding="utf-8"?>
-<ds:datastoreItem xmlns:ds="http://schemas.openxmlformats.org/officeDocument/2006/customXml" ds:itemID="{E778F20B-3565-4050-944B-44D5660F6633}">
+<ds:datastoreItem xmlns:ds="http://schemas.openxmlformats.org/officeDocument/2006/customXml" ds:itemID="{4D50B289-8446-4F81-A8B4-6E6E1337A620}">
   <ds:schemaRefs>
     <ds:schemaRef ds:uri="http://schemas.openxmlformats.org/officeDocument/2006/bibliography"/>
   </ds:schemaRefs>

</xml_diff>